<commit_message>
adjustment to link in no permit required IP letter
</commit_message>
<xml_diff>
--- a/services/core-api/app/templates/now/No Permit Required IP Letter.docx
+++ b/services/core-api/app/templates/now/No Permit Required IP Letter.docx
@@ -1,6 +1,6 @@
 
 <file path=word/document.xml><?xml version="1.0" encoding="utf-8"?>
-<w:document xmlns:wpc="http://schemas.microsoft.com/office/word/2010/wordprocessingCanvas" xmlns:cx="http://schemas.microsoft.com/office/drawing/2014/chartex" xmlns:cx1="http://schemas.microsoft.com/office/drawing/2015/9/8/chartex" xmlns:cx2="http://schemas.microsoft.com/office/drawing/2015/10/21/chartex" xmlns:cx3="http://schemas.microsoft.com/office/drawing/2016/5/9/chartex" xmlns:cx4="http://schemas.microsoft.com/office/drawing/2016/5/10/chartex" xmlns:cx5="http://schemas.microsoft.com/office/drawing/2016/5/11/chartex" xmlns:cx6="http://schemas.microsoft.com/office/drawing/2016/5/12/chartex" xmlns:cx7="http://schemas.microsoft.com/office/drawing/2016/5/13/chartex" xmlns:cx8="http://schemas.microsoft.com/office/drawing/2016/5/14/chartex" xmlns:mc="http://schemas.openxmlformats.org/markup-compatibility/2006" xmlns:aink="http://schemas.microsoft.com/office/drawing/2016/ink" xmlns:am3d="http://schemas.microsoft.com/office/drawing/2017/model3d" xmlns:o="urn:schemas-microsoft-com:office:office" xmlns:oel="http://schemas.microsoft.com/office/2019/extlst" xmlns:r="http://schemas.openxmlformats.org/officeDocument/2006/relationships" xmlns:m="http://schemas.openxmlformats.org/officeDocument/2006/math" xmlns:v="urn:schemas-microsoft-com:vml" xmlns:wp14="http://schemas.microsoft.com/office/word/2010/wordprocessingDrawing" xmlns:wp="http://schemas.openxmlformats.org/drawingml/2006/wordprocessingDrawing" xmlns:w10="urn:schemas-microsoft-com:office:word" xmlns:w="http://schemas.openxmlformats.org/wordprocessingml/2006/main" xmlns:w14="http://schemas.microsoft.com/office/word/2010/wordml" xmlns:w15="http://schemas.microsoft.com/office/word/2012/wordml" xmlns:w16cex="http://schemas.microsoft.com/office/word/2018/wordml/cex" xmlns:w16cid="http://schemas.microsoft.com/office/word/2016/wordml/cid" xmlns:w16="http://schemas.microsoft.com/office/word/2018/wordml" xmlns:w16du="http://schemas.microsoft.com/office/word/2023/wordml/word16du" xmlns:w16sdtdh="http://schemas.microsoft.com/office/word/2020/wordml/sdtdatahash" xmlns:w16se="http://schemas.microsoft.com/office/word/2015/wordml/symex" xmlns:wpg="http://schemas.microsoft.com/office/word/2010/wordprocessingGroup" xmlns:wpi="http://schemas.microsoft.com/office/word/2010/wordprocessingInk" xmlns:wne="http://schemas.microsoft.com/office/word/2006/wordml" xmlns:wps="http://schemas.microsoft.com/office/word/2010/wordprocessingShape" mc:Ignorable="w14 w15 w16se w16cid w16 w16cex w16sdtdh w16du wp14">
+<w:document xmlns:wpc="http://schemas.microsoft.com/office/word/2010/wordprocessingCanvas" xmlns:cx="http://schemas.microsoft.com/office/drawing/2014/chartex" xmlns:cx1="http://schemas.microsoft.com/office/drawing/2015/9/8/chartex" xmlns:cx2="http://schemas.microsoft.com/office/drawing/2015/10/21/chartex" xmlns:cx3="http://schemas.microsoft.com/office/drawing/2016/5/9/chartex" xmlns:cx4="http://schemas.microsoft.com/office/drawing/2016/5/10/chartex" xmlns:cx5="http://schemas.microsoft.com/office/drawing/2016/5/11/chartex" xmlns:cx6="http://schemas.microsoft.com/office/drawing/2016/5/12/chartex" xmlns:cx7="http://schemas.microsoft.com/office/drawing/2016/5/13/chartex" xmlns:cx8="http://schemas.microsoft.com/office/drawing/2016/5/14/chartex" xmlns:mc="http://schemas.openxmlformats.org/markup-compatibility/2006" xmlns:aink="http://schemas.microsoft.com/office/drawing/2016/ink" xmlns:am3d="http://schemas.microsoft.com/office/drawing/2017/model3d" xmlns:o="urn:schemas-microsoft-com:office:office" xmlns:oel="http://schemas.microsoft.com/office/2019/extlst" xmlns:r="http://schemas.openxmlformats.org/officeDocument/2006/relationships" xmlns:m="http://schemas.openxmlformats.org/officeDocument/2006/math" xmlns:v="urn:schemas-microsoft-com:vml" xmlns:wp14="http://schemas.microsoft.com/office/word/2010/wordprocessingDrawing" xmlns:wp="http://schemas.openxmlformats.org/drawingml/2006/wordprocessingDrawing" xmlns:w10="urn:schemas-microsoft-com:office:word" xmlns:w="http://schemas.openxmlformats.org/wordprocessingml/2006/main" xmlns:w14="http://schemas.microsoft.com/office/word/2010/wordml" xmlns:w15="http://schemas.microsoft.com/office/word/2012/wordml" xmlns:w16cex="http://schemas.microsoft.com/office/word/2018/wordml/cex" xmlns:w16cid="http://schemas.microsoft.com/office/word/2016/wordml/cid" xmlns:w16="http://schemas.microsoft.com/office/word/2018/wordml" xmlns:w16du="http://schemas.microsoft.com/office/word/2023/wordml/word16du" xmlns:w16sdtdh="http://schemas.microsoft.com/office/word/2020/wordml/sdtdatahash" xmlns:w16sdtfl="http://schemas.microsoft.com/office/word/2024/wordml/sdtformatlock" xmlns:w16se="http://schemas.microsoft.com/office/word/2015/wordml/symex" xmlns:wpg="http://schemas.microsoft.com/office/word/2010/wordprocessingGroup" xmlns:wpi="http://schemas.microsoft.com/office/word/2010/wordprocessingInk" xmlns:wne="http://schemas.microsoft.com/office/word/2006/wordml" xmlns:wps="http://schemas.microsoft.com/office/word/2010/wordprocessingShape" mc:Ignorable="w14 w15 w16se w16cid w16 w16cex w16sdtdh w16sdtfl w16du wp14">
   <w:body>
     <w:p>
       <w:pPr>
@@ -66,6 +66,7 @@
         <w:t>File: 14675-20-{</w:t>
       </w:r>
       <w:proofErr w:type="spellStart"/>
+      <w:proofErr w:type="gramStart"/>
       <w:r>
         <w:rPr>
           <w:rFonts w:eastAsia="Calibri" w:cs="Arial"/>
@@ -73,7 +74,17 @@
           <w:szCs w:val="22"/>
           <w:lang w:val="en-CA"/>
         </w:rPr>
-        <w:t>d.mine_no</w:t>
+        <w:t>d.mine</w:t>
+      </w:r>
+      <w:proofErr w:type="gramEnd"/>
+      <w:r>
+        <w:rPr>
+          <w:rFonts w:eastAsia="Calibri" w:cs="Arial"/>
+          <w:sz w:val="22"/>
+          <w:szCs w:val="22"/>
+          <w:lang w:val="en-CA"/>
+        </w:rPr>
+        <w:t>_no</w:t>
       </w:r>
       <w:proofErr w:type="spellEnd"/>
       <w:r>
@@ -119,7 +130,16 @@
           <w:sz w:val="22"/>
           <w:szCs w:val="22"/>
         </w:rPr>
-        <w:t>_address:convCRLF</w:t>
+        <w:t>_</w:t>
+      </w:r>
+      <w:proofErr w:type="gramStart"/>
+      <w:r>
+        <w:rPr>
+          <w:rFonts w:cs="Arial"/>
+          <w:sz w:val="22"/>
+          <w:szCs w:val="22"/>
+        </w:rPr>
+        <w:t>address:convCRLF</w:t>
       </w:r>
       <w:proofErr w:type="spellEnd"/>
       <w:r>
@@ -130,6 +150,7 @@
         </w:rPr>
         <w:t>()}</w:t>
       </w:r>
+      <w:proofErr w:type="gramEnd"/>
     </w:p>
     <w:p/>
     <w:p/>
@@ -164,7 +185,16 @@
           <w:sz w:val="22"/>
           <w:szCs w:val="22"/>
         </w:rPr>
-        <w:t>_name</w:t>
+        <w:t>_</w:t>
+      </w:r>
+      <w:proofErr w:type="gramStart"/>
+      <w:r>
+        <w:rPr>
+          <w:rFonts w:cs="Arial"/>
+          <w:sz w:val="22"/>
+          <w:szCs w:val="22"/>
+        </w:rPr>
+        <w:t>name</w:t>
       </w:r>
       <w:proofErr w:type="spellEnd"/>
       <w:r>
@@ -175,6 +205,7 @@
         </w:rPr>
         <w:t>},</w:t>
       </w:r>
+      <w:proofErr w:type="gramEnd"/>
     </w:p>
     <w:p>
       <w:pPr>
@@ -283,17 +314,24 @@
           <w:b/>
           <w:bCs/>
         </w:rPr>
-        <w:t xml:space="preserve">Property Name: </w:t>
-      </w:r>
+        <w:t xml:space="preserve">Property </w:t>
+      </w:r>
+      <w:proofErr w:type="gramStart"/>
       <w:r>
         <w:rPr>
           <w:b/>
           <w:bCs/>
         </w:rPr>
+        <w:t xml:space="preserve">Name: </w:t>
+      </w:r>
+      <w:r>
+        <w:rPr>
+          <w:b/>
+          <w:bCs/>
+        </w:rPr>
         <w:t>{</w:t>
       </w:r>
       <w:proofErr w:type="spellStart"/>
-      <w:proofErr w:type="gramStart"/>
       <w:r>
         <w:rPr>
           <w:b/>
@@ -594,7 +632,7 @@
           <w:rPr>
             <w:rStyle w:val="Hyperlink"/>
           </w:rPr>
-          <w:t>https://www2.gov.bc.ca/gov/content/industry/mineral-exploration-mining/permitting/reclamation-closure/annual-reporting-forms</w:t>
+          <w:t>https://www2.gov.bc.ca/gov/content/industry/mineral-exploration-mining/permitting/mine-permit-requirements/annual-reporting</w:t>
         </w:r>
       </w:hyperlink>
       <w:r>
@@ -916,6 +954,7 @@
           <w:szCs w:val="22"/>
         </w:rPr>
       </w:pPr>
+      <w:proofErr w:type="gramStart"/>
       <w:r>
         <w:rPr>
           <w:rFonts w:cs="Arial"/>
@@ -936,6 +975,23 @@
         <w:t xml:space="preserve"> {</w:t>
       </w:r>
       <w:proofErr w:type="spellStart"/>
+      <w:r>
+        <w:rPr>
+          <w:rFonts w:cs="Arial"/>
+          <w:sz w:val="22"/>
+          <w:szCs w:val="22"/>
+        </w:rPr>
+        <w:t>d.issuing</w:t>
+      </w:r>
+      <w:proofErr w:type="gramEnd"/>
+      <w:r>
+        <w:rPr>
+          <w:rFonts w:cs="Arial"/>
+          <w:sz w:val="22"/>
+          <w:szCs w:val="22"/>
+        </w:rPr>
+        <w:t>_inspector_</w:t>
+      </w:r>
       <w:proofErr w:type="gramStart"/>
       <w:r>
         <w:rPr>
@@ -943,8 +999,9 @@
           <w:sz w:val="22"/>
           <w:szCs w:val="22"/>
         </w:rPr>
-        <w:t>d.issuing</w:t>
-      </w:r>
+        <w:t>email:ifEM</w:t>
+      </w:r>
+      <w:proofErr w:type="spellEnd"/>
       <w:proofErr w:type="gramEnd"/>
       <w:r>
         <w:rPr>
@@ -952,17 +1009,36 @@
           <w:sz w:val="22"/>
           <w:szCs w:val="22"/>
         </w:rPr>
-        <w:t>_inspector_email:ifEM</w:t>
-      </w:r>
-      <w:proofErr w:type="spellEnd"/>
-      <w:r>
-        <w:rPr>
-          <w:rFonts w:cs="Arial"/>
-          <w:sz w:val="22"/>
-          <w:szCs w:val="22"/>
-        </w:rPr>
-        <w:t>():show(None)}</w:t>
-      </w:r>
+        <w:t>(</w:t>
+      </w:r>
+      <w:proofErr w:type="gramStart"/>
+      <w:r>
+        <w:rPr>
+          <w:rFonts w:cs="Arial"/>
+          <w:sz w:val="22"/>
+          <w:szCs w:val="22"/>
+        </w:rPr>
+        <w:t>):show</w:t>
+      </w:r>
+      <w:proofErr w:type="gramEnd"/>
+      <w:r>
+        <w:rPr>
+          <w:rFonts w:cs="Arial"/>
+          <w:sz w:val="22"/>
+          <w:szCs w:val="22"/>
+        </w:rPr>
+        <w:t>(</w:t>
+      </w:r>
+      <w:proofErr w:type="gramStart"/>
+      <w:r>
+        <w:rPr>
+          <w:rFonts w:cs="Arial"/>
+          <w:sz w:val="22"/>
+          <w:szCs w:val="22"/>
+        </w:rPr>
+        <w:t>None)}</w:t>
+      </w:r>
+      <w:proofErr w:type="gramEnd"/>
     </w:p>
     <w:p>
       <w:pPr>
@@ -1009,16 +1085,44 @@
           <w:sz w:val="22"/>
           <w:szCs w:val="22"/>
         </w:rPr>
-        <w:t>_inspector_phone:ifEM</w:t>
+        <w:t>_inspector_</w:t>
+      </w:r>
+      <w:proofErr w:type="gramStart"/>
+      <w:r>
+        <w:rPr>
+          <w:rFonts w:cs="Arial"/>
+          <w:sz w:val="22"/>
+          <w:szCs w:val="22"/>
+        </w:rPr>
+        <w:t>phone:ifEM</w:t>
       </w:r>
       <w:proofErr w:type="spellEnd"/>
-      <w:r>
-        <w:rPr>
-          <w:rFonts w:cs="Arial"/>
-          <w:sz w:val="22"/>
-          <w:szCs w:val="22"/>
-        </w:rPr>
-        <w:t>():show(None)}</w:t>
+      <w:proofErr w:type="gramEnd"/>
+      <w:r>
+        <w:rPr>
+          <w:rFonts w:cs="Arial"/>
+          <w:sz w:val="22"/>
+          <w:szCs w:val="22"/>
+        </w:rPr>
+        <w:t>(</w:t>
+      </w:r>
+      <w:proofErr w:type="gramStart"/>
+      <w:r>
+        <w:rPr>
+          <w:rFonts w:cs="Arial"/>
+          <w:sz w:val="22"/>
+          <w:szCs w:val="22"/>
+        </w:rPr>
+        <w:t>):show</w:t>
+      </w:r>
+      <w:proofErr w:type="gramEnd"/>
+      <w:r>
+        <w:rPr>
+          <w:rFonts w:cs="Arial"/>
+          <w:sz w:val="22"/>
+          <w:szCs w:val="22"/>
+        </w:rPr>
+        <w:t>(None)}</w:t>
       </w:r>
     </w:p>
     <w:sectPr>
@@ -1036,7 +1140,7 @@
 </file>
 
 <file path=word/endnotes.xml><?xml version="1.0" encoding="utf-8"?>
-<w:endnotes xmlns:wpc="http://schemas.microsoft.com/office/word/2010/wordprocessingCanvas" xmlns:cx="http://schemas.microsoft.com/office/drawing/2014/chartex" xmlns:cx1="http://schemas.microsoft.com/office/drawing/2015/9/8/chartex" xmlns:cx2="http://schemas.microsoft.com/office/drawing/2015/10/21/chartex" xmlns:cx3="http://schemas.microsoft.com/office/drawing/2016/5/9/chartex" xmlns:cx4="http://schemas.microsoft.com/office/drawing/2016/5/10/chartex" xmlns:cx5="http://schemas.microsoft.com/office/drawing/2016/5/11/chartex" xmlns:cx6="http://schemas.microsoft.com/office/drawing/2016/5/12/chartex" xmlns:cx7="http://schemas.microsoft.com/office/drawing/2016/5/13/chartex" xmlns:cx8="http://schemas.microsoft.com/office/drawing/2016/5/14/chartex" xmlns:mc="http://schemas.openxmlformats.org/markup-compatibility/2006" xmlns:aink="http://schemas.microsoft.com/office/drawing/2016/ink" xmlns:am3d="http://schemas.microsoft.com/office/drawing/2017/model3d" xmlns:o="urn:schemas-microsoft-com:office:office" xmlns:oel="http://schemas.microsoft.com/office/2019/extlst" xmlns:r="http://schemas.openxmlformats.org/officeDocument/2006/relationships" xmlns:m="http://schemas.openxmlformats.org/officeDocument/2006/math" xmlns:v="urn:schemas-microsoft-com:vml" xmlns:wp14="http://schemas.microsoft.com/office/word/2010/wordprocessingDrawing" xmlns:wp="http://schemas.openxmlformats.org/drawingml/2006/wordprocessingDrawing" xmlns:w10="urn:schemas-microsoft-com:office:word" xmlns:w="http://schemas.openxmlformats.org/wordprocessingml/2006/main" xmlns:w14="http://schemas.microsoft.com/office/word/2010/wordml" xmlns:w15="http://schemas.microsoft.com/office/word/2012/wordml" xmlns:w16cex="http://schemas.microsoft.com/office/word/2018/wordml/cex" xmlns:w16cid="http://schemas.microsoft.com/office/word/2016/wordml/cid" xmlns:w16="http://schemas.microsoft.com/office/word/2018/wordml" xmlns:w16du="http://schemas.microsoft.com/office/word/2023/wordml/word16du" xmlns:w16sdtdh="http://schemas.microsoft.com/office/word/2020/wordml/sdtdatahash" xmlns:w16se="http://schemas.microsoft.com/office/word/2015/wordml/symex" xmlns:wpg="http://schemas.microsoft.com/office/word/2010/wordprocessingGroup" xmlns:wpi="http://schemas.microsoft.com/office/word/2010/wordprocessingInk" xmlns:wne="http://schemas.microsoft.com/office/word/2006/wordml" xmlns:wps="http://schemas.microsoft.com/office/word/2010/wordprocessingShape" mc:Ignorable="w14 w15 w16se w16cid w16 w16cex w16sdtdh w16du wp14">
+<w:endnotes xmlns:wpc="http://schemas.microsoft.com/office/word/2010/wordprocessingCanvas" xmlns:cx="http://schemas.microsoft.com/office/drawing/2014/chartex" xmlns:cx1="http://schemas.microsoft.com/office/drawing/2015/9/8/chartex" xmlns:cx2="http://schemas.microsoft.com/office/drawing/2015/10/21/chartex" xmlns:cx3="http://schemas.microsoft.com/office/drawing/2016/5/9/chartex" xmlns:cx4="http://schemas.microsoft.com/office/drawing/2016/5/10/chartex" xmlns:cx5="http://schemas.microsoft.com/office/drawing/2016/5/11/chartex" xmlns:cx6="http://schemas.microsoft.com/office/drawing/2016/5/12/chartex" xmlns:cx7="http://schemas.microsoft.com/office/drawing/2016/5/13/chartex" xmlns:cx8="http://schemas.microsoft.com/office/drawing/2016/5/14/chartex" xmlns:mc="http://schemas.openxmlformats.org/markup-compatibility/2006" xmlns:aink="http://schemas.microsoft.com/office/drawing/2016/ink" xmlns:am3d="http://schemas.microsoft.com/office/drawing/2017/model3d" xmlns:o="urn:schemas-microsoft-com:office:office" xmlns:oel="http://schemas.microsoft.com/office/2019/extlst" xmlns:r="http://schemas.openxmlformats.org/officeDocument/2006/relationships" xmlns:m="http://schemas.openxmlformats.org/officeDocument/2006/math" xmlns:v="urn:schemas-microsoft-com:vml" xmlns:wp14="http://schemas.microsoft.com/office/word/2010/wordprocessingDrawing" xmlns:wp="http://schemas.openxmlformats.org/drawingml/2006/wordprocessingDrawing" xmlns:w10="urn:schemas-microsoft-com:office:word" xmlns:w="http://schemas.openxmlformats.org/wordprocessingml/2006/main" xmlns:w14="http://schemas.microsoft.com/office/word/2010/wordml" xmlns:w15="http://schemas.microsoft.com/office/word/2012/wordml" xmlns:w16cex="http://schemas.microsoft.com/office/word/2018/wordml/cex" xmlns:w16cid="http://schemas.microsoft.com/office/word/2016/wordml/cid" xmlns:w16="http://schemas.microsoft.com/office/word/2018/wordml" xmlns:w16du="http://schemas.microsoft.com/office/word/2023/wordml/word16du" xmlns:w16sdtdh="http://schemas.microsoft.com/office/word/2020/wordml/sdtdatahash" xmlns:w16sdtfl="http://schemas.microsoft.com/office/word/2024/wordml/sdtformatlock" xmlns:w16se="http://schemas.microsoft.com/office/word/2015/wordml/symex" xmlns:wpg="http://schemas.microsoft.com/office/word/2010/wordprocessingGroup" xmlns:wpi="http://schemas.microsoft.com/office/word/2010/wordprocessingInk" xmlns:wne="http://schemas.microsoft.com/office/word/2006/wordml" xmlns:wps="http://schemas.microsoft.com/office/word/2010/wordprocessingShape" mc:Ignorable="w14 w15 w16se w16cid w16 w16cex w16sdtdh w16sdtfl w16du wp14">
   <w:endnote w:type="separator" w:id="-1">
     <w:p>
       <w:r>
@@ -1055,7 +1159,7 @@
 </file>
 
 <file path=word/footer1.xml><?xml version="1.0" encoding="utf-8"?>
-<w:ftr xmlns:wpc="http://schemas.microsoft.com/office/word/2010/wordprocessingCanvas" xmlns:cx="http://schemas.microsoft.com/office/drawing/2014/chartex" xmlns:cx1="http://schemas.microsoft.com/office/drawing/2015/9/8/chartex" xmlns:cx2="http://schemas.microsoft.com/office/drawing/2015/10/21/chartex" xmlns:cx3="http://schemas.microsoft.com/office/drawing/2016/5/9/chartex" xmlns:cx4="http://schemas.microsoft.com/office/drawing/2016/5/10/chartex" xmlns:cx5="http://schemas.microsoft.com/office/drawing/2016/5/11/chartex" xmlns:cx6="http://schemas.microsoft.com/office/drawing/2016/5/12/chartex" xmlns:cx7="http://schemas.microsoft.com/office/drawing/2016/5/13/chartex" xmlns:cx8="http://schemas.microsoft.com/office/drawing/2016/5/14/chartex" xmlns:mc="http://schemas.openxmlformats.org/markup-compatibility/2006" xmlns:aink="http://schemas.microsoft.com/office/drawing/2016/ink" xmlns:am3d="http://schemas.microsoft.com/office/drawing/2017/model3d" xmlns:o="urn:schemas-microsoft-com:office:office" xmlns:oel="http://schemas.microsoft.com/office/2019/extlst" xmlns:r="http://schemas.openxmlformats.org/officeDocument/2006/relationships" xmlns:m="http://schemas.openxmlformats.org/officeDocument/2006/math" xmlns:v="urn:schemas-microsoft-com:vml" xmlns:wp14="http://schemas.microsoft.com/office/word/2010/wordprocessingDrawing" xmlns:wp="http://schemas.openxmlformats.org/drawingml/2006/wordprocessingDrawing" xmlns:w10="urn:schemas-microsoft-com:office:word" xmlns:w="http://schemas.openxmlformats.org/wordprocessingml/2006/main" xmlns:w14="http://schemas.microsoft.com/office/word/2010/wordml" xmlns:w15="http://schemas.microsoft.com/office/word/2012/wordml" xmlns:w16cex="http://schemas.microsoft.com/office/word/2018/wordml/cex" xmlns:w16cid="http://schemas.microsoft.com/office/word/2016/wordml/cid" xmlns:w16="http://schemas.microsoft.com/office/word/2018/wordml" xmlns:w16du="http://schemas.microsoft.com/office/word/2023/wordml/word16du" xmlns:w16sdtdh="http://schemas.microsoft.com/office/word/2020/wordml/sdtdatahash" xmlns:w16se="http://schemas.microsoft.com/office/word/2015/wordml/symex" xmlns:wpg="http://schemas.microsoft.com/office/word/2010/wordprocessingGroup" xmlns:wpi="http://schemas.microsoft.com/office/word/2010/wordprocessingInk" xmlns:wne="http://schemas.microsoft.com/office/word/2006/wordml" xmlns:wps="http://schemas.microsoft.com/office/word/2010/wordprocessingShape" mc:Ignorable="w14 w15 w16se w16cid w16 w16cex w16sdtdh w16du wp14">
+<w:ftr xmlns:wpc="http://schemas.microsoft.com/office/word/2010/wordprocessingCanvas" xmlns:cx="http://schemas.microsoft.com/office/drawing/2014/chartex" xmlns:cx1="http://schemas.microsoft.com/office/drawing/2015/9/8/chartex" xmlns:cx2="http://schemas.microsoft.com/office/drawing/2015/10/21/chartex" xmlns:cx3="http://schemas.microsoft.com/office/drawing/2016/5/9/chartex" xmlns:cx4="http://schemas.microsoft.com/office/drawing/2016/5/10/chartex" xmlns:cx5="http://schemas.microsoft.com/office/drawing/2016/5/11/chartex" xmlns:cx6="http://schemas.microsoft.com/office/drawing/2016/5/12/chartex" xmlns:cx7="http://schemas.microsoft.com/office/drawing/2016/5/13/chartex" xmlns:cx8="http://schemas.microsoft.com/office/drawing/2016/5/14/chartex" xmlns:mc="http://schemas.openxmlformats.org/markup-compatibility/2006" xmlns:aink="http://schemas.microsoft.com/office/drawing/2016/ink" xmlns:am3d="http://schemas.microsoft.com/office/drawing/2017/model3d" xmlns:o="urn:schemas-microsoft-com:office:office" xmlns:oel="http://schemas.microsoft.com/office/2019/extlst" xmlns:r="http://schemas.openxmlformats.org/officeDocument/2006/relationships" xmlns:m="http://schemas.openxmlformats.org/officeDocument/2006/math" xmlns:v="urn:schemas-microsoft-com:vml" xmlns:wp14="http://schemas.microsoft.com/office/word/2010/wordprocessingDrawing" xmlns:wp="http://schemas.openxmlformats.org/drawingml/2006/wordprocessingDrawing" xmlns:w10="urn:schemas-microsoft-com:office:word" xmlns:w="http://schemas.openxmlformats.org/wordprocessingml/2006/main" xmlns:w14="http://schemas.microsoft.com/office/word/2010/wordml" xmlns:w15="http://schemas.microsoft.com/office/word/2012/wordml" xmlns:w16cex="http://schemas.microsoft.com/office/word/2018/wordml/cex" xmlns:w16cid="http://schemas.microsoft.com/office/word/2016/wordml/cid" xmlns:w16="http://schemas.microsoft.com/office/word/2018/wordml" xmlns:w16du="http://schemas.microsoft.com/office/word/2023/wordml/word16du" xmlns:w16sdtdh="http://schemas.microsoft.com/office/word/2020/wordml/sdtdatahash" xmlns:w16sdtfl="http://schemas.microsoft.com/office/word/2024/wordml/sdtformatlock" xmlns:w16se="http://schemas.microsoft.com/office/word/2015/wordml/symex" xmlns:wpg="http://schemas.microsoft.com/office/word/2010/wordprocessingGroup" xmlns:wpi="http://schemas.microsoft.com/office/word/2010/wordprocessingInk" xmlns:wne="http://schemas.microsoft.com/office/word/2006/wordml" xmlns:wps="http://schemas.microsoft.com/office/word/2010/wordprocessingShape" mc:Ignorable="w14 w15 w16se w16cid w16 w16cex w16sdtdh w16sdtfl w16du wp14">
   <w:p>
     <w:pPr>
       <w:widowControl/>
@@ -1322,7 +1426,7 @@
 </file>
 
 <file path=word/footer2.xml><?xml version="1.0" encoding="utf-8"?>
-<w:ftr xmlns:wpc="http://schemas.microsoft.com/office/word/2010/wordprocessingCanvas" xmlns:cx="http://schemas.microsoft.com/office/drawing/2014/chartex" xmlns:cx1="http://schemas.microsoft.com/office/drawing/2015/9/8/chartex" xmlns:cx2="http://schemas.microsoft.com/office/drawing/2015/10/21/chartex" xmlns:cx3="http://schemas.microsoft.com/office/drawing/2016/5/9/chartex" xmlns:cx4="http://schemas.microsoft.com/office/drawing/2016/5/10/chartex" xmlns:cx5="http://schemas.microsoft.com/office/drawing/2016/5/11/chartex" xmlns:cx6="http://schemas.microsoft.com/office/drawing/2016/5/12/chartex" xmlns:cx7="http://schemas.microsoft.com/office/drawing/2016/5/13/chartex" xmlns:cx8="http://schemas.microsoft.com/office/drawing/2016/5/14/chartex" xmlns:mc="http://schemas.openxmlformats.org/markup-compatibility/2006" xmlns:aink="http://schemas.microsoft.com/office/drawing/2016/ink" xmlns:am3d="http://schemas.microsoft.com/office/drawing/2017/model3d" xmlns:o="urn:schemas-microsoft-com:office:office" xmlns:oel="http://schemas.microsoft.com/office/2019/extlst" xmlns:r="http://schemas.openxmlformats.org/officeDocument/2006/relationships" xmlns:m="http://schemas.openxmlformats.org/officeDocument/2006/math" xmlns:v="urn:schemas-microsoft-com:vml" xmlns:wp14="http://schemas.microsoft.com/office/word/2010/wordprocessingDrawing" xmlns:wp="http://schemas.openxmlformats.org/drawingml/2006/wordprocessingDrawing" xmlns:w10="urn:schemas-microsoft-com:office:word" xmlns:w="http://schemas.openxmlformats.org/wordprocessingml/2006/main" xmlns:w14="http://schemas.microsoft.com/office/word/2010/wordml" xmlns:w15="http://schemas.microsoft.com/office/word/2012/wordml" xmlns:w16cex="http://schemas.microsoft.com/office/word/2018/wordml/cex" xmlns:w16cid="http://schemas.microsoft.com/office/word/2016/wordml/cid" xmlns:w16="http://schemas.microsoft.com/office/word/2018/wordml" xmlns:w16du="http://schemas.microsoft.com/office/word/2023/wordml/word16du" xmlns:w16sdtdh="http://schemas.microsoft.com/office/word/2020/wordml/sdtdatahash" xmlns:w16se="http://schemas.microsoft.com/office/word/2015/wordml/symex" xmlns:wpg="http://schemas.microsoft.com/office/word/2010/wordprocessingGroup" xmlns:wpi="http://schemas.microsoft.com/office/word/2010/wordprocessingInk" xmlns:wne="http://schemas.microsoft.com/office/word/2006/wordml" xmlns:wps="http://schemas.microsoft.com/office/word/2010/wordprocessingShape" mc:Ignorable="w14 w15 w16se w16cid w16 w16cex w16sdtdh w16du wp14">
+<w:ftr xmlns:wpc="http://schemas.microsoft.com/office/word/2010/wordprocessingCanvas" xmlns:cx="http://schemas.microsoft.com/office/drawing/2014/chartex" xmlns:cx1="http://schemas.microsoft.com/office/drawing/2015/9/8/chartex" xmlns:cx2="http://schemas.microsoft.com/office/drawing/2015/10/21/chartex" xmlns:cx3="http://schemas.microsoft.com/office/drawing/2016/5/9/chartex" xmlns:cx4="http://schemas.microsoft.com/office/drawing/2016/5/10/chartex" xmlns:cx5="http://schemas.microsoft.com/office/drawing/2016/5/11/chartex" xmlns:cx6="http://schemas.microsoft.com/office/drawing/2016/5/12/chartex" xmlns:cx7="http://schemas.microsoft.com/office/drawing/2016/5/13/chartex" xmlns:cx8="http://schemas.microsoft.com/office/drawing/2016/5/14/chartex" xmlns:mc="http://schemas.openxmlformats.org/markup-compatibility/2006" xmlns:aink="http://schemas.microsoft.com/office/drawing/2016/ink" xmlns:am3d="http://schemas.microsoft.com/office/drawing/2017/model3d" xmlns:o="urn:schemas-microsoft-com:office:office" xmlns:oel="http://schemas.microsoft.com/office/2019/extlst" xmlns:r="http://schemas.openxmlformats.org/officeDocument/2006/relationships" xmlns:m="http://schemas.openxmlformats.org/officeDocument/2006/math" xmlns:v="urn:schemas-microsoft-com:vml" xmlns:wp14="http://schemas.microsoft.com/office/word/2010/wordprocessingDrawing" xmlns:wp="http://schemas.openxmlformats.org/drawingml/2006/wordprocessingDrawing" xmlns:w10="urn:schemas-microsoft-com:office:word" xmlns:w="http://schemas.openxmlformats.org/wordprocessingml/2006/main" xmlns:w14="http://schemas.microsoft.com/office/word/2010/wordml" xmlns:w15="http://schemas.microsoft.com/office/word/2012/wordml" xmlns:w16cex="http://schemas.microsoft.com/office/word/2018/wordml/cex" xmlns:w16cid="http://schemas.microsoft.com/office/word/2016/wordml/cid" xmlns:w16="http://schemas.microsoft.com/office/word/2018/wordml" xmlns:w16du="http://schemas.microsoft.com/office/word/2023/wordml/word16du" xmlns:w16sdtdh="http://schemas.microsoft.com/office/word/2020/wordml/sdtdatahash" xmlns:w16sdtfl="http://schemas.microsoft.com/office/word/2024/wordml/sdtformatlock" xmlns:w16se="http://schemas.microsoft.com/office/word/2015/wordml/symex" xmlns:wpg="http://schemas.microsoft.com/office/word/2010/wordprocessingGroup" xmlns:wpi="http://schemas.microsoft.com/office/word/2010/wordprocessingInk" xmlns:wne="http://schemas.microsoft.com/office/word/2006/wordml" xmlns:wps="http://schemas.microsoft.com/office/word/2010/wordprocessingShape" mc:Ignorable="w14 w15 w16se w16cid w16 w16cex w16sdtdh w16sdtfl w16du wp14">
   <w:p>
     <w:pPr>
       <w:ind w:left="180" w:right="-288" w:hanging="270"/>
@@ -1505,7 +1609,6 @@
       <w:tc>
         <w:tcPr>
           <w:tcW w:w="3327" w:type="dxa"/>
-          <w:shd w:val="clear" w:color="auto" w:fill="auto"/>
         </w:tcPr>
         <w:p>
           <w:pPr>
@@ -1572,7 +1675,6 @@
       <w:tc>
         <w:tcPr>
           <w:tcW w:w="3477" w:type="dxa"/>
-          <w:shd w:val="clear" w:color="auto" w:fill="auto"/>
         </w:tcPr>
         <w:p>
           <w:pPr>
@@ -1685,7 +1787,6 @@
       <w:tc>
         <w:tcPr>
           <w:tcW w:w="3246" w:type="dxa"/>
-          <w:shd w:val="clear" w:color="auto" w:fill="auto"/>
         </w:tcPr>
         <w:p>
           <w:pPr>
@@ -1782,7 +1883,7 @@
 </file>
 
 <file path=word/footnotes.xml><?xml version="1.0" encoding="utf-8"?>
-<w:footnotes xmlns:wpc="http://schemas.microsoft.com/office/word/2010/wordprocessingCanvas" xmlns:cx="http://schemas.microsoft.com/office/drawing/2014/chartex" xmlns:cx1="http://schemas.microsoft.com/office/drawing/2015/9/8/chartex" xmlns:cx2="http://schemas.microsoft.com/office/drawing/2015/10/21/chartex" xmlns:cx3="http://schemas.microsoft.com/office/drawing/2016/5/9/chartex" xmlns:cx4="http://schemas.microsoft.com/office/drawing/2016/5/10/chartex" xmlns:cx5="http://schemas.microsoft.com/office/drawing/2016/5/11/chartex" xmlns:cx6="http://schemas.microsoft.com/office/drawing/2016/5/12/chartex" xmlns:cx7="http://schemas.microsoft.com/office/drawing/2016/5/13/chartex" xmlns:cx8="http://schemas.microsoft.com/office/drawing/2016/5/14/chartex" xmlns:mc="http://schemas.openxmlformats.org/markup-compatibility/2006" xmlns:aink="http://schemas.microsoft.com/office/drawing/2016/ink" xmlns:am3d="http://schemas.microsoft.com/office/drawing/2017/model3d" xmlns:o="urn:schemas-microsoft-com:office:office" xmlns:oel="http://schemas.microsoft.com/office/2019/extlst" xmlns:r="http://schemas.openxmlformats.org/officeDocument/2006/relationships" xmlns:m="http://schemas.openxmlformats.org/officeDocument/2006/math" xmlns:v="urn:schemas-microsoft-com:vml" xmlns:wp14="http://schemas.microsoft.com/office/word/2010/wordprocessingDrawing" xmlns:wp="http://schemas.openxmlformats.org/drawingml/2006/wordprocessingDrawing" xmlns:w10="urn:schemas-microsoft-com:office:word" xmlns:w="http://schemas.openxmlformats.org/wordprocessingml/2006/main" xmlns:w14="http://schemas.microsoft.com/office/word/2010/wordml" xmlns:w15="http://schemas.microsoft.com/office/word/2012/wordml" xmlns:w16cex="http://schemas.microsoft.com/office/word/2018/wordml/cex" xmlns:w16cid="http://schemas.microsoft.com/office/word/2016/wordml/cid" xmlns:w16="http://schemas.microsoft.com/office/word/2018/wordml" xmlns:w16du="http://schemas.microsoft.com/office/word/2023/wordml/word16du" xmlns:w16sdtdh="http://schemas.microsoft.com/office/word/2020/wordml/sdtdatahash" xmlns:w16se="http://schemas.microsoft.com/office/word/2015/wordml/symex" xmlns:wpg="http://schemas.microsoft.com/office/word/2010/wordprocessingGroup" xmlns:wpi="http://schemas.microsoft.com/office/word/2010/wordprocessingInk" xmlns:wne="http://schemas.microsoft.com/office/word/2006/wordml" xmlns:wps="http://schemas.microsoft.com/office/word/2010/wordprocessingShape" mc:Ignorable="w14 w15 w16se w16cid w16 w16cex w16sdtdh w16du wp14">
+<w:footnotes xmlns:wpc="http://schemas.microsoft.com/office/word/2010/wordprocessingCanvas" xmlns:cx="http://schemas.microsoft.com/office/drawing/2014/chartex" xmlns:cx1="http://schemas.microsoft.com/office/drawing/2015/9/8/chartex" xmlns:cx2="http://schemas.microsoft.com/office/drawing/2015/10/21/chartex" xmlns:cx3="http://schemas.microsoft.com/office/drawing/2016/5/9/chartex" xmlns:cx4="http://schemas.microsoft.com/office/drawing/2016/5/10/chartex" xmlns:cx5="http://schemas.microsoft.com/office/drawing/2016/5/11/chartex" xmlns:cx6="http://schemas.microsoft.com/office/drawing/2016/5/12/chartex" xmlns:cx7="http://schemas.microsoft.com/office/drawing/2016/5/13/chartex" xmlns:cx8="http://schemas.microsoft.com/office/drawing/2016/5/14/chartex" xmlns:mc="http://schemas.openxmlformats.org/markup-compatibility/2006" xmlns:aink="http://schemas.microsoft.com/office/drawing/2016/ink" xmlns:am3d="http://schemas.microsoft.com/office/drawing/2017/model3d" xmlns:o="urn:schemas-microsoft-com:office:office" xmlns:oel="http://schemas.microsoft.com/office/2019/extlst" xmlns:r="http://schemas.openxmlformats.org/officeDocument/2006/relationships" xmlns:m="http://schemas.openxmlformats.org/officeDocument/2006/math" xmlns:v="urn:schemas-microsoft-com:vml" xmlns:wp14="http://schemas.microsoft.com/office/word/2010/wordprocessingDrawing" xmlns:wp="http://schemas.openxmlformats.org/drawingml/2006/wordprocessingDrawing" xmlns:w10="urn:schemas-microsoft-com:office:word" xmlns:w="http://schemas.openxmlformats.org/wordprocessingml/2006/main" xmlns:w14="http://schemas.microsoft.com/office/word/2010/wordml" xmlns:w15="http://schemas.microsoft.com/office/word/2012/wordml" xmlns:w16cex="http://schemas.microsoft.com/office/word/2018/wordml/cex" xmlns:w16cid="http://schemas.microsoft.com/office/word/2016/wordml/cid" xmlns:w16="http://schemas.microsoft.com/office/word/2018/wordml" xmlns:w16du="http://schemas.microsoft.com/office/word/2023/wordml/word16du" xmlns:w16sdtdh="http://schemas.microsoft.com/office/word/2020/wordml/sdtdatahash" xmlns:w16sdtfl="http://schemas.microsoft.com/office/word/2024/wordml/sdtformatlock" xmlns:w16se="http://schemas.microsoft.com/office/word/2015/wordml/symex" xmlns:wpg="http://schemas.microsoft.com/office/word/2010/wordprocessingGroup" xmlns:wpi="http://schemas.microsoft.com/office/word/2010/wordprocessingInk" xmlns:wne="http://schemas.microsoft.com/office/word/2006/wordml" xmlns:wps="http://schemas.microsoft.com/office/word/2010/wordprocessingShape" mc:Ignorable="w14 w15 w16se w16cid w16 w16cex w16sdtdh w16sdtfl w16du wp14">
   <w:footnote w:type="separator" w:id="-1">
     <w:p>
       <w:r>
@@ -1801,7 +1902,7 @@
 </file>
 
 <file path=word/header1.xml><?xml version="1.0" encoding="utf-8"?>
-<w:hdr xmlns:wpc="http://schemas.microsoft.com/office/word/2010/wordprocessingCanvas" xmlns:cx="http://schemas.microsoft.com/office/drawing/2014/chartex" xmlns:cx1="http://schemas.microsoft.com/office/drawing/2015/9/8/chartex" xmlns:cx2="http://schemas.microsoft.com/office/drawing/2015/10/21/chartex" xmlns:cx3="http://schemas.microsoft.com/office/drawing/2016/5/9/chartex" xmlns:cx4="http://schemas.microsoft.com/office/drawing/2016/5/10/chartex" xmlns:cx5="http://schemas.microsoft.com/office/drawing/2016/5/11/chartex" xmlns:cx6="http://schemas.microsoft.com/office/drawing/2016/5/12/chartex" xmlns:cx7="http://schemas.microsoft.com/office/drawing/2016/5/13/chartex" xmlns:cx8="http://schemas.microsoft.com/office/drawing/2016/5/14/chartex" xmlns:mc="http://schemas.openxmlformats.org/markup-compatibility/2006" xmlns:aink="http://schemas.microsoft.com/office/drawing/2016/ink" xmlns:am3d="http://schemas.microsoft.com/office/drawing/2017/model3d" xmlns:o="urn:schemas-microsoft-com:office:office" xmlns:oel="http://schemas.microsoft.com/office/2019/extlst" xmlns:r="http://schemas.openxmlformats.org/officeDocument/2006/relationships" xmlns:m="http://schemas.openxmlformats.org/officeDocument/2006/math" xmlns:v="urn:schemas-microsoft-com:vml" xmlns:wp14="http://schemas.microsoft.com/office/word/2010/wordprocessingDrawing" xmlns:wp="http://schemas.openxmlformats.org/drawingml/2006/wordprocessingDrawing" xmlns:w10="urn:schemas-microsoft-com:office:word" xmlns:w="http://schemas.openxmlformats.org/wordprocessingml/2006/main" xmlns:w14="http://schemas.microsoft.com/office/word/2010/wordml" xmlns:w15="http://schemas.microsoft.com/office/word/2012/wordml" xmlns:w16cex="http://schemas.microsoft.com/office/word/2018/wordml/cex" xmlns:w16cid="http://schemas.microsoft.com/office/word/2016/wordml/cid" xmlns:w16="http://schemas.microsoft.com/office/word/2018/wordml" xmlns:w16du="http://schemas.microsoft.com/office/word/2023/wordml/word16du" xmlns:w16sdtdh="http://schemas.microsoft.com/office/word/2020/wordml/sdtdatahash" xmlns:w16se="http://schemas.microsoft.com/office/word/2015/wordml/symex" xmlns:wpg="http://schemas.microsoft.com/office/word/2010/wordprocessingGroup" xmlns:wpi="http://schemas.microsoft.com/office/word/2010/wordprocessingInk" xmlns:wne="http://schemas.microsoft.com/office/word/2006/wordml" xmlns:wps="http://schemas.microsoft.com/office/word/2010/wordprocessingShape" mc:Ignorable="w14 w15 w16se w16cid w16 w16cex w16sdtdh w16du wp14">
+<w:hdr xmlns:wpc="http://schemas.microsoft.com/office/word/2010/wordprocessingCanvas" xmlns:cx="http://schemas.microsoft.com/office/drawing/2014/chartex" xmlns:cx1="http://schemas.microsoft.com/office/drawing/2015/9/8/chartex" xmlns:cx2="http://schemas.microsoft.com/office/drawing/2015/10/21/chartex" xmlns:cx3="http://schemas.microsoft.com/office/drawing/2016/5/9/chartex" xmlns:cx4="http://schemas.microsoft.com/office/drawing/2016/5/10/chartex" xmlns:cx5="http://schemas.microsoft.com/office/drawing/2016/5/11/chartex" xmlns:cx6="http://schemas.microsoft.com/office/drawing/2016/5/12/chartex" xmlns:cx7="http://schemas.microsoft.com/office/drawing/2016/5/13/chartex" xmlns:cx8="http://schemas.microsoft.com/office/drawing/2016/5/14/chartex" xmlns:mc="http://schemas.openxmlformats.org/markup-compatibility/2006" xmlns:aink="http://schemas.microsoft.com/office/drawing/2016/ink" xmlns:am3d="http://schemas.microsoft.com/office/drawing/2017/model3d" xmlns:o="urn:schemas-microsoft-com:office:office" xmlns:oel="http://schemas.microsoft.com/office/2019/extlst" xmlns:r="http://schemas.openxmlformats.org/officeDocument/2006/relationships" xmlns:m="http://schemas.openxmlformats.org/officeDocument/2006/math" xmlns:v="urn:schemas-microsoft-com:vml" xmlns:wp14="http://schemas.microsoft.com/office/word/2010/wordprocessingDrawing" xmlns:wp="http://schemas.openxmlformats.org/drawingml/2006/wordprocessingDrawing" xmlns:w10="urn:schemas-microsoft-com:office:word" xmlns:w="http://schemas.openxmlformats.org/wordprocessingml/2006/main" xmlns:w14="http://schemas.microsoft.com/office/word/2010/wordml" xmlns:w15="http://schemas.microsoft.com/office/word/2012/wordml" xmlns:w16cex="http://schemas.microsoft.com/office/word/2018/wordml/cex" xmlns:w16cid="http://schemas.microsoft.com/office/word/2016/wordml/cid" xmlns:w16="http://schemas.microsoft.com/office/word/2018/wordml" xmlns:w16du="http://schemas.microsoft.com/office/word/2023/wordml/word16du" xmlns:w16sdtdh="http://schemas.microsoft.com/office/word/2020/wordml/sdtdatahash" xmlns:w16sdtfl="http://schemas.microsoft.com/office/word/2024/wordml/sdtformatlock" xmlns:w16se="http://schemas.microsoft.com/office/word/2015/wordml/symex" xmlns:wpg="http://schemas.microsoft.com/office/word/2010/wordprocessingGroup" xmlns:wpi="http://schemas.microsoft.com/office/word/2010/wordprocessingInk" xmlns:wne="http://schemas.microsoft.com/office/word/2006/wordml" xmlns:wps="http://schemas.microsoft.com/office/word/2010/wordprocessingShape" mc:Ignorable="w14 w15 w16se w16cid w16 w16cex w16sdtdh w16sdtfl w16du wp14">
   <w:tbl>
     <w:tblPr>
       <w:tblW w:w="10080" w:type="dxa"/>
@@ -1911,7 +2012,7 @@
 </file>
 
 <file path=word/numbering.xml><?xml version="1.0" encoding="utf-8"?>
-<w:numbering xmlns:wpc="http://schemas.microsoft.com/office/word/2010/wordprocessingCanvas" xmlns:cx="http://schemas.microsoft.com/office/drawing/2014/chartex" xmlns:cx1="http://schemas.microsoft.com/office/drawing/2015/9/8/chartex" xmlns:cx2="http://schemas.microsoft.com/office/drawing/2015/10/21/chartex" xmlns:cx3="http://schemas.microsoft.com/office/drawing/2016/5/9/chartex" xmlns:cx4="http://schemas.microsoft.com/office/drawing/2016/5/10/chartex" xmlns:cx5="http://schemas.microsoft.com/office/drawing/2016/5/11/chartex" xmlns:cx6="http://schemas.microsoft.com/office/drawing/2016/5/12/chartex" xmlns:cx7="http://schemas.microsoft.com/office/drawing/2016/5/13/chartex" xmlns:cx8="http://schemas.microsoft.com/office/drawing/2016/5/14/chartex" xmlns:mc="http://schemas.openxmlformats.org/markup-compatibility/2006" xmlns:aink="http://schemas.microsoft.com/office/drawing/2016/ink" xmlns:am3d="http://schemas.microsoft.com/office/drawing/2017/model3d" xmlns:o="urn:schemas-microsoft-com:office:office" xmlns:oel="http://schemas.microsoft.com/office/2019/extlst" xmlns:r="http://schemas.openxmlformats.org/officeDocument/2006/relationships" xmlns:m="http://schemas.openxmlformats.org/officeDocument/2006/math" xmlns:v="urn:schemas-microsoft-com:vml" xmlns:wp14="http://schemas.microsoft.com/office/word/2010/wordprocessingDrawing" xmlns:wp="http://schemas.openxmlformats.org/drawingml/2006/wordprocessingDrawing" xmlns:w10="urn:schemas-microsoft-com:office:word" xmlns:w="http://schemas.openxmlformats.org/wordprocessingml/2006/main" xmlns:w14="http://schemas.microsoft.com/office/word/2010/wordml" xmlns:w15="http://schemas.microsoft.com/office/word/2012/wordml" xmlns:w16cex="http://schemas.microsoft.com/office/word/2018/wordml/cex" xmlns:w16cid="http://schemas.microsoft.com/office/word/2016/wordml/cid" xmlns:w16="http://schemas.microsoft.com/office/word/2018/wordml" xmlns:w16du="http://schemas.microsoft.com/office/word/2023/wordml/word16du" xmlns:w16sdtdh="http://schemas.microsoft.com/office/word/2020/wordml/sdtdatahash" xmlns:w16se="http://schemas.microsoft.com/office/word/2015/wordml/symex" xmlns:wpg="http://schemas.microsoft.com/office/word/2010/wordprocessingGroup" xmlns:wpi="http://schemas.microsoft.com/office/word/2010/wordprocessingInk" xmlns:wne="http://schemas.microsoft.com/office/word/2006/wordml" xmlns:wps="http://schemas.microsoft.com/office/word/2010/wordprocessingShape" mc:Ignorable="w14 w15 w16se w16cid w16 w16cex w16sdtdh w16du wp14">
+<w:numbering xmlns:wpc="http://schemas.microsoft.com/office/word/2010/wordprocessingCanvas" xmlns:cx="http://schemas.microsoft.com/office/drawing/2014/chartex" xmlns:cx1="http://schemas.microsoft.com/office/drawing/2015/9/8/chartex" xmlns:cx2="http://schemas.microsoft.com/office/drawing/2015/10/21/chartex" xmlns:cx3="http://schemas.microsoft.com/office/drawing/2016/5/9/chartex" xmlns:cx4="http://schemas.microsoft.com/office/drawing/2016/5/10/chartex" xmlns:cx5="http://schemas.microsoft.com/office/drawing/2016/5/11/chartex" xmlns:cx6="http://schemas.microsoft.com/office/drawing/2016/5/12/chartex" xmlns:cx7="http://schemas.microsoft.com/office/drawing/2016/5/13/chartex" xmlns:cx8="http://schemas.microsoft.com/office/drawing/2016/5/14/chartex" xmlns:mc="http://schemas.openxmlformats.org/markup-compatibility/2006" xmlns:aink="http://schemas.microsoft.com/office/drawing/2016/ink" xmlns:am3d="http://schemas.microsoft.com/office/drawing/2017/model3d" xmlns:o="urn:schemas-microsoft-com:office:office" xmlns:oel="http://schemas.microsoft.com/office/2019/extlst" xmlns:r="http://schemas.openxmlformats.org/officeDocument/2006/relationships" xmlns:m="http://schemas.openxmlformats.org/officeDocument/2006/math" xmlns:v="urn:schemas-microsoft-com:vml" xmlns:wp14="http://schemas.microsoft.com/office/word/2010/wordprocessingDrawing" xmlns:wp="http://schemas.openxmlformats.org/drawingml/2006/wordprocessingDrawing" xmlns:w10="urn:schemas-microsoft-com:office:word" xmlns:w="http://schemas.openxmlformats.org/wordprocessingml/2006/main" xmlns:w14="http://schemas.microsoft.com/office/word/2010/wordml" xmlns:w15="http://schemas.microsoft.com/office/word/2012/wordml" xmlns:w16cex="http://schemas.microsoft.com/office/word/2018/wordml/cex" xmlns:w16cid="http://schemas.microsoft.com/office/word/2016/wordml/cid" xmlns:w16="http://schemas.microsoft.com/office/word/2018/wordml" xmlns:w16du="http://schemas.microsoft.com/office/word/2023/wordml/word16du" xmlns:w16sdtdh="http://schemas.microsoft.com/office/word/2020/wordml/sdtdatahash" xmlns:w16sdtfl="http://schemas.microsoft.com/office/word/2024/wordml/sdtformatlock" xmlns:w16se="http://schemas.microsoft.com/office/word/2015/wordml/symex" xmlns:wpg="http://schemas.microsoft.com/office/word/2010/wordprocessingGroup" xmlns:wpi="http://schemas.microsoft.com/office/word/2010/wordprocessingInk" xmlns:wne="http://schemas.microsoft.com/office/word/2006/wordml" xmlns:wps="http://schemas.microsoft.com/office/word/2010/wordprocessingShape" mc:Ignorable="w14 w15 w16se w16cid w16 w16cex w16sdtdh w16sdtfl w16du wp14">
   <w:abstractNum w:abstractNumId="0" w15:restartNumberingAfterBreak="0">
     <w:nsid w:val="182046E7"/>
     <w:multiLevelType w:val="hybridMultilevel"/>
@@ -2101,7 +2202,7 @@
 </file>
 
 <file path=word/styles.xml><?xml version="1.0" encoding="utf-8"?>
-<w:styles xmlns:mc="http://schemas.openxmlformats.org/markup-compatibility/2006" xmlns:r="http://schemas.openxmlformats.org/officeDocument/2006/relationships" xmlns:w="http://schemas.openxmlformats.org/wordprocessingml/2006/main" xmlns:w14="http://schemas.microsoft.com/office/word/2010/wordml" xmlns:w15="http://schemas.microsoft.com/office/word/2012/wordml" xmlns:w16cex="http://schemas.microsoft.com/office/word/2018/wordml/cex" xmlns:w16cid="http://schemas.microsoft.com/office/word/2016/wordml/cid" xmlns:w16="http://schemas.microsoft.com/office/word/2018/wordml" xmlns:w16du="http://schemas.microsoft.com/office/word/2023/wordml/word16du" xmlns:w16sdtdh="http://schemas.microsoft.com/office/word/2020/wordml/sdtdatahash" xmlns:w16se="http://schemas.microsoft.com/office/word/2015/wordml/symex" mc:Ignorable="w14 w15 w16se w16cid w16 w16cex w16sdtdh w16du">
+<w:styles xmlns:mc="http://schemas.openxmlformats.org/markup-compatibility/2006" xmlns:r="http://schemas.openxmlformats.org/officeDocument/2006/relationships" xmlns:w="http://schemas.openxmlformats.org/wordprocessingml/2006/main" xmlns:w14="http://schemas.microsoft.com/office/word/2010/wordml" xmlns:w15="http://schemas.microsoft.com/office/word/2012/wordml" xmlns:w16cex="http://schemas.microsoft.com/office/word/2018/wordml/cex" xmlns:w16cid="http://schemas.microsoft.com/office/word/2016/wordml/cid" xmlns:w16="http://schemas.microsoft.com/office/word/2018/wordml" xmlns:w16du="http://schemas.microsoft.com/office/word/2023/wordml/word16du" xmlns:w16sdtdh="http://schemas.microsoft.com/office/word/2020/wordml/sdtdatahash" xmlns:w16sdtfl="http://schemas.microsoft.com/office/word/2024/wordml/sdtformatlock" xmlns:w16se="http://schemas.microsoft.com/office/word/2015/wordml/symex" mc:Ignorable="w14 w15 w16se w16cid w16 w16cex w16sdtdh w16sdtfl w16du">
   <w:docDefaults>
     <w:rPrDefault>
       <w:rPr>

</xml_diff>

<commit_message>
[MDS-6600] adjustment to link in no permit required IP letter (#3777)
adjustment to link in no permit required IP letter
</commit_message>
<xml_diff>
--- a/services/core-api/app/templates/now/No Permit Required IP Letter.docx
+++ b/services/core-api/app/templates/now/No Permit Required IP Letter.docx
@@ -1,6 +1,6 @@
 
 <file path=word/document.xml><?xml version="1.0" encoding="utf-8"?>
-<w:document xmlns:wpc="http://schemas.microsoft.com/office/word/2010/wordprocessingCanvas" xmlns:cx="http://schemas.microsoft.com/office/drawing/2014/chartex" xmlns:cx1="http://schemas.microsoft.com/office/drawing/2015/9/8/chartex" xmlns:cx2="http://schemas.microsoft.com/office/drawing/2015/10/21/chartex" xmlns:cx3="http://schemas.microsoft.com/office/drawing/2016/5/9/chartex" xmlns:cx4="http://schemas.microsoft.com/office/drawing/2016/5/10/chartex" xmlns:cx5="http://schemas.microsoft.com/office/drawing/2016/5/11/chartex" xmlns:cx6="http://schemas.microsoft.com/office/drawing/2016/5/12/chartex" xmlns:cx7="http://schemas.microsoft.com/office/drawing/2016/5/13/chartex" xmlns:cx8="http://schemas.microsoft.com/office/drawing/2016/5/14/chartex" xmlns:mc="http://schemas.openxmlformats.org/markup-compatibility/2006" xmlns:aink="http://schemas.microsoft.com/office/drawing/2016/ink" xmlns:am3d="http://schemas.microsoft.com/office/drawing/2017/model3d" xmlns:o="urn:schemas-microsoft-com:office:office" xmlns:oel="http://schemas.microsoft.com/office/2019/extlst" xmlns:r="http://schemas.openxmlformats.org/officeDocument/2006/relationships" xmlns:m="http://schemas.openxmlformats.org/officeDocument/2006/math" xmlns:v="urn:schemas-microsoft-com:vml" xmlns:wp14="http://schemas.microsoft.com/office/word/2010/wordprocessingDrawing" xmlns:wp="http://schemas.openxmlformats.org/drawingml/2006/wordprocessingDrawing" xmlns:w10="urn:schemas-microsoft-com:office:word" xmlns:w="http://schemas.openxmlformats.org/wordprocessingml/2006/main" xmlns:w14="http://schemas.microsoft.com/office/word/2010/wordml" xmlns:w15="http://schemas.microsoft.com/office/word/2012/wordml" xmlns:w16cex="http://schemas.microsoft.com/office/word/2018/wordml/cex" xmlns:w16cid="http://schemas.microsoft.com/office/word/2016/wordml/cid" xmlns:w16="http://schemas.microsoft.com/office/word/2018/wordml" xmlns:w16du="http://schemas.microsoft.com/office/word/2023/wordml/word16du" xmlns:w16sdtdh="http://schemas.microsoft.com/office/word/2020/wordml/sdtdatahash" xmlns:w16se="http://schemas.microsoft.com/office/word/2015/wordml/symex" xmlns:wpg="http://schemas.microsoft.com/office/word/2010/wordprocessingGroup" xmlns:wpi="http://schemas.microsoft.com/office/word/2010/wordprocessingInk" xmlns:wne="http://schemas.microsoft.com/office/word/2006/wordml" xmlns:wps="http://schemas.microsoft.com/office/word/2010/wordprocessingShape" mc:Ignorable="w14 w15 w16se w16cid w16 w16cex w16sdtdh w16du wp14">
+<w:document xmlns:wpc="http://schemas.microsoft.com/office/word/2010/wordprocessingCanvas" xmlns:cx="http://schemas.microsoft.com/office/drawing/2014/chartex" xmlns:cx1="http://schemas.microsoft.com/office/drawing/2015/9/8/chartex" xmlns:cx2="http://schemas.microsoft.com/office/drawing/2015/10/21/chartex" xmlns:cx3="http://schemas.microsoft.com/office/drawing/2016/5/9/chartex" xmlns:cx4="http://schemas.microsoft.com/office/drawing/2016/5/10/chartex" xmlns:cx5="http://schemas.microsoft.com/office/drawing/2016/5/11/chartex" xmlns:cx6="http://schemas.microsoft.com/office/drawing/2016/5/12/chartex" xmlns:cx7="http://schemas.microsoft.com/office/drawing/2016/5/13/chartex" xmlns:cx8="http://schemas.microsoft.com/office/drawing/2016/5/14/chartex" xmlns:mc="http://schemas.openxmlformats.org/markup-compatibility/2006" xmlns:aink="http://schemas.microsoft.com/office/drawing/2016/ink" xmlns:am3d="http://schemas.microsoft.com/office/drawing/2017/model3d" xmlns:o="urn:schemas-microsoft-com:office:office" xmlns:oel="http://schemas.microsoft.com/office/2019/extlst" xmlns:r="http://schemas.openxmlformats.org/officeDocument/2006/relationships" xmlns:m="http://schemas.openxmlformats.org/officeDocument/2006/math" xmlns:v="urn:schemas-microsoft-com:vml" xmlns:wp14="http://schemas.microsoft.com/office/word/2010/wordprocessingDrawing" xmlns:wp="http://schemas.openxmlformats.org/drawingml/2006/wordprocessingDrawing" xmlns:w10="urn:schemas-microsoft-com:office:word" xmlns:w="http://schemas.openxmlformats.org/wordprocessingml/2006/main" xmlns:w14="http://schemas.microsoft.com/office/word/2010/wordml" xmlns:w15="http://schemas.microsoft.com/office/word/2012/wordml" xmlns:w16cex="http://schemas.microsoft.com/office/word/2018/wordml/cex" xmlns:w16cid="http://schemas.microsoft.com/office/word/2016/wordml/cid" xmlns:w16="http://schemas.microsoft.com/office/word/2018/wordml" xmlns:w16du="http://schemas.microsoft.com/office/word/2023/wordml/word16du" xmlns:w16sdtdh="http://schemas.microsoft.com/office/word/2020/wordml/sdtdatahash" xmlns:w16sdtfl="http://schemas.microsoft.com/office/word/2024/wordml/sdtformatlock" xmlns:w16se="http://schemas.microsoft.com/office/word/2015/wordml/symex" xmlns:wpg="http://schemas.microsoft.com/office/word/2010/wordprocessingGroup" xmlns:wpi="http://schemas.microsoft.com/office/word/2010/wordprocessingInk" xmlns:wne="http://schemas.microsoft.com/office/word/2006/wordml" xmlns:wps="http://schemas.microsoft.com/office/word/2010/wordprocessingShape" mc:Ignorable="w14 w15 w16se w16cid w16 w16cex w16sdtdh w16sdtfl w16du wp14">
   <w:body>
     <w:p>
       <w:pPr>
@@ -66,6 +66,7 @@
         <w:t>File: 14675-20-{</w:t>
       </w:r>
       <w:proofErr w:type="spellStart"/>
+      <w:proofErr w:type="gramStart"/>
       <w:r>
         <w:rPr>
           <w:rFonts w:eastAsia="Calibri" w:cs="Arial"/>
@@ -73,7 +74,17 @@
           <w:szCs w:val="22"/>
           <w:lang w:val="en-CA"/>
         </w:rPr>
-        <w:t>d.mine_no</w:t>
+        <w:t>d.mine</w:t>
+      </w:r>
+      <w:proofErr w:type="gramEnd"/>
+      <w:r>
+        <w:rPr>
+          <w:rFonts w:eastAsia="Calibri" w:cs="Arial"/>
+          <w:sz w:val="22"/>
+          <w:szCs w:val="22"/>
+          <w:lang w:val="en-CA"/>
+        </w:rPr>
+        <w:t>_no</w:t>
       </w:r>
       <w:proofErr w:type="spellEnd"/>
       <w:r>
@@ -119,7 +130,16 @@
           <w:sz w:val="22"/>
           <w:szCs w:val="22"/>
         </w:rPr>
-        <w:t>_address:convCRLF</w:t>
+        <w:t>_</w:t>
+      </w:r>
+      <w:proofErr w:type="gramStart"/>
+      <w:r>
+        <w:rPr>
+          <w:rFonts w:cs="Arial"/>
+          <w:sz w:val="22"/>
+          <w:szCs w:val="22"/>
+        </w:rPr>
+        <w:t>address:convCRLF</w:t>
       </w:r>
       <w:proofErr w:type="spellEnd"/>
       <w:r>
@@ -130,6 +150,7 @@
         </w:rPr>
         <w:t>()}</w:t>
       </w:r>
+      <w:proofErr w:type="gramEnd"/>
     </w:p>
     <w:p/>
     <w:p/>
@@ -164,7 +185,16 @@
           <w:sz w:val="22"/>
           <w:szCs w:val="22"/>
         </w:rPr>
-        <w:t>_name</w:t>
+        <w:t>_</w:t>
+      </w:r>
+      <w:proofErr w:type="gramStart"/>
+      <w:r>
+        <w:rPr>
+          <w:rFonts w:cs="Arial"/>
+          <w:sz w:val="22"/>
+          <w:szCs w:val="22"/>
+        </w:rPr>
+        <w:t>name</w:t>
       </w:r>
       <w:proofErr w:type="spellEnd"/>
       <w:r>
@@ -175,6 +205,7 @@
         </w:rPr>
         <w:t>},</w:t>
       </w:r>
+      <w:proofErr w:type="gramEnd"/>
     </w:p>
     <w:p>
       <w:pPr>
@@ -283,17 +314,24 @@
           <w:b/>
           <w:bCs/>
         </w:rPr>
-        <w:t xml:space="preserve">Property Name: </w:t>
-      </w:r>
+        <w:t xml:space="preserve">Property </w:t>
+      </w:r>
+      <w:proofErr w:type="gramStart"/>
       <w:r>
         <w:rPr>
           <w:b/>
           <w:bCs/>
         </w:rPr>
+        <w:t xml:space="preserve">Name: </w:t>
+      </w:r>
+      <w:r>
+        <w:rPr>
+          <w:b/>
+          <w:bCs/>
+        </w:rPr>
         <w:t>{</w:t>
       </w:r>
       <w:proofErr w:type="spellStart"/>
-      <w:proofErr w:type="gramStart"/>
       <w:r>
         <w:rPr>
           <w:b/>
@@ -594,7 +632,7 @@
           <w:rPr>
             <w:rStyle w:val="Hyperlink"/>
           </w:rPr>
-          <w:t>https://www2.gov.bc.ca/gov/content/industry/mineral-exploration-mining/permitting/reclamation-closure/annual-reporting-forms</w:t>
+          <w:t>https://www2.gov.bc.ca/gov/content/industry/mineral-exploration-mining/permitting/mine-permit-requirements/annual-reporting</w:t>
         </w:r>
       </w:hyperlink>
       <w:r>
@@ -916,6 +954,7 @@
           <w:szCs w:val="22"/>
         </w:rPr>
       </w:pPr>
+      <w:proofErr w:type="gramStart"/>
       <w:r>
         <w:rPr>
           <w:rFonts w:cs="Arial"/>
@@ -936,6 +975,23 @@
         <w:t xml:space="preserve"> {</w:t>
       </w:r>
       <w:proofErr w:type="spellStart"/>
+      <w:r>
+        <w:rPr>
+          <w:rFonts w:cs="Arial"/>
+          <w:sz w:val="22"/>
+          <w:szCs w:val="22"/>
+        </w:rPr>
+        <w:t>d.issuing</w:t>
+      </w:r>
+      <w:proofErr w:type="gramEnd"/>
+      <w:r>
+        <w:rPr>
+          <w:rFonts w:cs="Arial"/>
+          <w:sz w:val="22"/>
+          <w:szCs w:val="22"/>
+        </w:rPr>
+        <w:t>_inspector_</w:t>
+      </w:r>
       <w:proofErr w:type="gramStart"/>
       <w:r>
         <w:rPr>
@@ -943,8 +999,9 @@
           <w:sz w:val="22"/>
           <w:szCs w:val="22"/>
         </w:rPr>
-        <w:t>d.issuing</w:t>
-      </w:r>
+        <w:t>email:ifEM</w:t>
+      </w:r>
+      <w:proofErr w:type="spellEnd"/>
       <w:proofErr w:type="gramEnd"/>
       <w:r>
         <w:rPr>
@@ -952,17 +1009,36 @@
           <w:sz w:val="22"/>
           <w:szCs w:val="22"/>
         </w:rPr>
-        <w:t>_inspector_email:ifEM</w:t>
-      </w:r>
-      <w:proofErr w:type="spellEnd"/>
-      <w:r>
-        <w:rPr>
-          <w:rFonts w:cs="Arial"/>
-          <w:sz w:val="22"/>
-          <w:szCs w:val="22"/>
-        </w:rPr>
-        <w:t>():show(None)}</w:t>
-      </w:r>
+        <w:t>(</w:t>
+      </w:r>
+      <w:proofErr w:type="gramStart"/>
+      <w:r>
+        <w:rPr>
+          <w:rFonts w:cs="Arial"/>
+          <w:sz w:val="22"/>
+          <w:szCs w:val="22"/>
+        </w:rPr>
+        <w:t>):show</w:t>
+      </w:r>
+      <w:proofErr w:type="gramEnd"/>
+      <w:r>
+        <w:rPr>
+          <w:rFonts w:cs="Arial"/>
+          <w:sz w:val="22"/>
+          <w:szCs w:val="22"/>
+        </w:rPr>
+        <w:t>(</w:t>
+      </w:r>
+      <w:proofErr w:type="gramStart"/>
+      <w:r>
+        <w:rPr>
+          <w:rFonts w:cs="Arial"/>
+          <w:sz w:val="22"/>
+          <w:szCs w:val="22"/>
+        </w:rPr>
+        <w:t>None)}</w:t>
+      </w:r>
+      <w:proofErr w:type="gramEnd"/>
     </w:p>
     <w:p>
       <w:pPr>
@@ -1009,16 +1085,44 @@
           <w:sz w:val="22"/>
           <w:szCs w:val="22"/>
         </w:rPr>
-        <w:t>_inspector_phone:ifEM</w:t>
+        <w:t>_inspector_</w:t>
+      </w:r>
+      <w:proofErr w:type="gramStart"/>
+      <w:r>
+        <w:rPr>
+          <w:rFonts w:cs="Arial"/>
+          <w:sz w:val="22"/>
+          <w:szCs w:val="22"/>
+        </w:rPr>
+        <w:t>phone:ifEM</w:t>
       </w:r>
       <w:proofErr w:type="spellEnd"/>
-      <w:r>
-        <w:rPr>
-          <w:rFonts w:cs="Arial"/>
-          <w:sz w:val="22"/>
-          <w:szCs w:val="22"/>
-        </w:rPr>
-        <w:t>():show(None)}</w:t>
+      <w:proofErr w:type="gramEnd"/>
+      <w:r>
+        <w:rPr>
+          <w:rFonts w:cs="Arial"/>
+          <w:sz w:val="22"/>
+          <w:szCs w:val="22"/>
+        </w:rPr>
+        <w:t>(</w:t>
+      </w:r>
+      <w:proofErr w:type="gramStart"/>
+      <w:r>
+        <w:rPr>
+          <w:rFonts w:cs="Arial"/>
+          <w:sz w:val="22"/>
+          <w:szCs w:val="22"/>
+        </w:rPr>
+        <w:t>):show</w:t>
+      </w:r>
+      <w:proofErr w:type="gramEnd"/>
+      <w:r>
+        <w:rPr>
+          <w:rFonts w:cs="Arial"/>
+          <w:sz w:val="22"/>
+          <w:szCs w:val="22"/>
+        </w:rPr>
+        <w:t>(None)}</w:t>
       </w:r>
     </w:p>
     <w:sectPr>
@@ -1036,7 +1140,7 @@
 </file>
 
 <file path=word/endnotes.xml><?xml version="1.0" encoding="utf-8"?>
-<w:endnotes xmlns:wpc="http://schemas.microsoft.com/office/word/2010/wordprocessingCanvas" xmlns:cx="http://schemas.microsoft.com/office/drawing/2014/chartex" xmlns:cx1="http://schemas.microsoft.com/office/drawing/2015/9/8/chartex" xmlns:cx2="http://schemas.microsoft.com/office/drawing/2015/10/21/chartex" xmlns:cx3="http://schemas.microsoft.com/office/drawing/2016/5/9/chartex" xmlns:cx4="http://schemas.microsoft.com/office/drawing/2016/5/10/chartex" xmlns:cx5="http://schemas.microsoft.com/office/drawing/2016/5/11/chartex" xmlns:cx6="http://schemas.microsoft.com/office/drawing/2016/5/12/chartex" xmlns:cx7="http://schemas.microsoft.com/office/drawing/2016/5/13/chartex" xmlns:cx8="http://schemas.microsoft.com/office/drawing/2016/5/14/chartex" xmlns:mc="http://schemas.openxmlformats.org/markup-compatibility/2006" xmlns:aink="http://schemas.microsoft.com/office/drawing/2016/ink" xmlns:am3d="http://schemas.microsoft.com/office/drawing/2017/model3d" xmlns:o="urn:schemas-microsoft-com:office:office" xmlns:oel="http://schemas.microsoft.com/office/2019/extlst" xmlns:r="http://schemas.openxmlformats.org/officeDocument/2006/relationships" xmlns:m="http://schemas.openxmlformats.org/officeDocument/2006/math" xmlns:v="urn:schemas-microsoft-com:vml" xmlns:wp14="http://schemas.microsoft.com/office/word/2010/wordprocessingDrawing" xmlns:wp="http://schemas.openxmlformats.org/drawingml/2006/wordprocessingDrawing" xmlns:w10="urn:schemas-microsoft-com:office:word" xmlns:w="http://schemas.openxmlformats.org/wordprocessingml/2006/main" xmlns:w14="http://schemas.microsoft.com/office/word/2010/wordml" xmlns:w15="http://schemas.microsoft.com/office/word/2012/wordml" xmlns:w16cex="http://schemas.microsoft.com/office/word/2018/wordml/cex" xmlns:w16cid="http://schemas.microsoft.com/office/word/2016/wordml/cid" xmlns:w16="http://schemas.microsoft.com/office/word/2018/wordml" xmlns:w16du="http://schemas.microsoft.com/office/word/2023/wordml/word16du" xmlns:w16sdtdh="http://schemas.microsoft.com/office/word/2020/wordml/sdtdatahash" xmlns:w16se="http://schemas.microsoft.com/office/word/2015/wordml/symex" xmlns:wpg="http://schemas.microsoft.com/office/word/2010/wordprocessingGroup" xmlns:wpi="http://schemas.microsoft.com/office/word/2010/wordprocessingInk" xmlns:wne="http://schemas.microsoft.com/office/word/2006/wordml" xmlns:wps="http://schemas.microsoft.com/office/word/2010/wordprocessingShape" mc:Ignorable="w14 w15 w16se w16cid w16 w16cex w16sdtdh w16du wp14">
+<w:endnotes xmlns:wpc="http://schemas.microsoft.com/office/word/2010/wordprocessingCanvas" xmlns:cx="http://schemas.microsoft.com/office/drawing/2014/chartex" xmlns:cx1="http://schemas.microsoft.com/office/drawing/2015/9/8/chartex" xmlns:cx2="http://schemas.microsoft.com/office/drawing/2015/10/21/chartex" xmlns:cx3="http://schemas.microsoft.com/office/drawing/2016/5/9/chartex" xmlns:cx4="http://schemas.microsoft.com/office/drawing/2016/5/10/chartex" xmlns:cx5="http://schemas.microsoft.com/office/drawing/2016/5/11/chartex" xmlns:cx6="http://schemas.microsoft.com/office/drawing/2016/5/12/chartex" xmlns:cx7="http://schemas.microsoft.com/office/drawing/2016/5/13/chartex" xmlns:cx8="http://schemas.microsoft.com/office/drawing/2016/5/14/chartex" xmlns:mc="http://schemas.openxmlformats.org/markup-compatibility/2006" xmlns:aink="http://schemas.microsoft.com/office/drawing/2016/ink" xmlns:am3d="http://schemas.microsoft.com/office/drawing/2017/model3d" xmlns:o="urn:schemas-microsoft-com:office:office" xmlns:oel="http://schemas.microsoft.com/office/2019/extlst" xmlns:r="http://schemas.openxmlformats.org/officeDocument/2006/relationships" xmlns:m="http://schemas.openxmlformats.org/officeDocument/2006/math" xmlns:v="urn:schemas-microsoft-com:vml" xmlns:wp14="http://schemas.microsoft.com/office/word/2010/wordprocessingDrawing" xmlns:wp="http://schemas.openxmlformats.org/drawingml/2006/wordprocessingDrawing" xmlns:w10="urn:schemas-microsoft-com:office:word" xmlns:w="http://schemas.openxmlformats.org/wordprocessingml/2006/main" xmlns:w14="http://schemas.microsoft.com/office/word/2010/wordml" xmlns:w15="http://schemas.microsoft.com/office/word/2012/wordml" xmlns:w16cex="http://schemas.microsoft.com/office/word/2018/wordml/cex" xmlns:w16cid="http://schemas.microsoft.com/office/word/2016/wordml/cid" xmlns:w16="http://schemas.microsoft.com/office/word/2018/wordml" xmlns:w16du="http://schemas.microsoft.com/office/word/2023/wordml/word16du" xmlns:w16sdtdh="http://schemas.microsoft.com/office/word/2020/wordml/sdtdatahash" xmlns:w16sdtfl="http://schemas.microsoft.com/office/word/2024/wordml/sdtformatlock" xmlns:w16se="http://schemas.microsoft.com/office/word/2015/wordml/symex" xmlns:wpg="http://schemas.microsoft.com/office/word/2010/wordprocessingGroup" xmlns:wpi="http://schemas.microsoft.com/office/word/2010/wordprocessingInk" xmlns:wne="http://schemas.microsoft.com/office/word/2006/wordml" xmlns:wps="http://schemas.microsoft.com/office/word/2010/wordprocessingShape" mc:Ignorable="w14 w15 w16se w16cid w16 w16cex w16sdtdh w16sdtfl w16du wp14">
   <w:endnote w:type="separator" w:id="-1">
     <w:p>
       <w:r>
@@ -1055,7 +1159,7 @@
 </file>
 
 <file path=word/footer1.xml><?xml version="1.0" encoding="utf-8"?>
-<w:ftr xmlns:wpc="http://schemas.microsoft.com/office/word/2010/wordprocessingCanvas" xmlns:cx="http://schemas.microsoft.com/office/drawing/2014/chartex" xmlns:cx1="http://schemas.microsoft.com/office/drawing/2015/9/8/chartex" xmlns:cx2="http://schemas.microsoft.com/office/drawing/2015/10/21/chartex" xmlns:cx3="http://schemas.microsoft.com/office/drawing/2016/5/9/chartex" xmlns:cx4="http://schemas.microsoft.com/office/drawing/2016/5/10/chartex" xmlns:cx5="http://schemas.microsoft.com/office/drawing/2016/5/11/chartex" xmlns:cx6="http://schemas.microsoft.com/office/drawing/2016/5/12/chartex" xmlns:cx7="http://schemas.microsoft.com/office/drawing/2016/5/13/chartex" xmlns:cx8="http://schemas.microsoft.com/office/drawing/2016/5/14/chartex" xmlns:mc="http://schemas.openxmlformats.org/markup-compatibility/2006" xmlns:aink="http://schemas.microsoft.com/office/drawing/2016/ink" xmlns:am3d="http://schemas.microsoft.com/office/drawing/2017/model3d" xmlns:o="urn:schemas-microsoft-com:office:office" xmlns:oel="http://schemas.microsoft.com/office/2019/extlst" xmlns:r="http://schemas.openxmlformats.org/officeDocument/2006/relationships" xmlns:m="http://schemas.openxmlformats.org/officeDocument/2006/math" xmlns:v="urn:schemas-microsoft-com:vml" xmlns:wp14="http://schemas.microsoft.com/office/word/2010/wordprocessingDrawing" xmlns:wp="http://schemas.openxmlformats.org/drawingml/2006/wordprocessingDrawing" xmlns:w10="urn:schemas-microsoft-com:office:word" xmlns:w="http://schemas.openxmlformats.org/wordprocessingml/2006/main" xmlns:w14="http://schemas.microsoft.com/office/word/2010/wordml" xmlns:w15="http://schemas.microsoft.com/office/word/2012/wordml" xmlns:w16cex="http://schemas.microsoft.com/office/word/2018/wordml/cex" xmlns:w16cid="http://schemas.microsoft.com/office/word/2016/wordml/cid" xmlns:w16="http://schemas.microsoft.com/office/word/2018/wordml" xmlns:w16du="http://schemas.microsoft.com/office/word/2023/wordml/word16du" xmlns:w16sdtdh="http://schemas.microsoft.com/office/word/2020/wordml/sdtdatahash" xmlns:w16se="http://schemas.microsoft.com/office/word/2015/wordml/symex" xmlns:wpg="http://schemas.microsoft.com/office/word/2010/wordprocessingGroup" xmlns:wpi="http://schemas.microsoft.com/office/word/2010/wordprocessingInk" xmlns:wne="http://schemas.microsoft.com/office/word/2006/wordml" xmlns:wps="http://schemas.microsoft.com/office/word/2010/wordprocessingShape" mc:Ignorable="w14 w15 w16se w16cid w16 w16cex w16sdtdh w16du wp14">
+<w:ftr xmlns:wpc="http://schemas.microsoft.com/office/word/2010/wordprocessingCanvas" xmlns:cx="http://schemas.microsoft.com/office/drawing/2014/chartex" xmlns:cx1="http://schemas.microsoft.com/office/drawing/2015/9/8/chartex" xmlns:cx2="http://schemas.microsoft.com/office/drawing/2015/10/21/chartex" xmlns:cx3="http://schemas.microsoft.com/office/drawing/2016/5/9/chartex" xmlns:cx4="http://schemas.microsoft.com/office/drawing/2016/5/10/chartex" xmlns:cx5="http://schemas.microsoft.com/office/drawing/2016/5/11/chartex" xmlns:cx6="http://schemas.microsoft.com/office/drawing/2016/5/12/chartex" xmlns:cx7="http://schemas.microsoft.com/office/drawing/2016/5/13/chartex" xmlns:cx8="http://schemas.microsoft.com/office/drawing/2016/5/14/chartex" xmlns:mc="http://schemas.openxmlformats.org/markup-compatibility/2006" xmlns:aink="http://schemas.microsoft.com/office/drawing/2016/ink" xmlns:am3d="http://schemas.microsoft.com/office/drawing/2017/model3d" xmlns:o="urn:schemas-microsoft-com:office:office" xmlns:oel="http://schemas.microsoft.com/office/2019/extlst" xmlns:r="http://schemas.openxmlformats.org/officeDocument/2006/relationships" xmlns:m="http://schemas.openxmlformats.org/officeDocument/2006/math" xmlns:v="urn:schemas-microsoft-com:vml" xmlns:wp14="http://schemas.microsoft.com/office/word/2010/wordprocessingDrawing" xmlns:wp="http://schemas.openxmlformats.org/drawingml/2006/wordprocessingDrawing" xmlns:w10="urn:schemas-microsoft-com:office:word" xmlns:w="http://schemas.openxmlformats.org/wordprocessingml/2006/main" xmlns:w14="http://schemas.microsoft.com/office/word/2010/wordml" xmlns:w15="http://schemas.microsoft.com/office/word/2012/wordml" xmlns:w16cex="http://schemas.microsoft.com/office/word/2018/wordml/cex" xmlns:w16cid="http://schemas.microsoft.com/office/word/2016/wordml/cid" xmlns:w16="http://schemas.microsoft.com/office/word/2018/wordml" xmlns:w16du="http://schemas.microsoft.com/office/word/2023/wordml/word16du" xmlns:w16sdtdh="http://schemas.microsoft.com/office/word/2020/wordml/sdtdatahash" xmlns:w16sdtfl="http://schemas.microsoft.com/office/word/2024/wordml/sdtformatlock" xmlns:w16se="http://schemas.microsoft.com/office/word/2015/wordml/symex" xmlns:wpg="http://schemas.microsoft.com/office/word/2010/wordprocessingGroup" xmlns:wpi="http://schemas.microsoft.com/office/word/2010/wordprocessingInk" xmlns:wne="http://schemas.microsoft.com/office/word/2006/wordml" xmlns:wps="http://schemas.microsoft.com/office/word/2010/wordprocessingShape" mc:Ignorable="w14 w15 w16se w16cid w16 w16cex w16sdtdh w16sdtfl w16du wp14">
   <w:p>
     <w:pPr>
       <w:widowControl/>
@@ -1322,7 +1426,7 @@
 </file>
 
 <file path=word/footer2.xml><?xml version="1.0" encoding="utf-8"?>
-<w:ftr xmlns:wpc="http://schemas.microsoft.com/office/word/2010/wordprocessingCanvas" xmlns:cx="http://schemas.microsoft.com/office/drawing/2014/chartex" xmlns:cx1="http://schemas.microsoft.com/office/drawing/2015/9/8/chartex" xmlns:cx2="http://schemas.microsoft.com/office/drawing/2015/10/21/chartex" xmlns:cx3="http://schemas.microsoft.com/office/drawing/2016/5/9/chartex" xmlns:cx4="http://schemas.microsoft.com/office/drawing/2016/5/10/chartex" xmlns:cx5="http://schemas.microsoft.com/office/drawing/2016/5/11/chartex" xmlns:cx6="http://schemas.microsoft.com/office/drawing/2016/5/12/chartex" xmlns:cx7="http://schemas.microsoft.com/office/drawing/2016/5/13/chartex" xmlns:cx8="http://schemas.microsoft.com/office/drawing/2016/5/14/chartex" xmlns:mc="http://schemas.openxmlformats.org/markup-compatibility/2006" xmlns:aink="http://schemas.microsoft.com/office/drawing/2016/ink" xmlns:am3d="http://schemas.microsoft.com/office/drawing/2017/model3d" xmlns:o="urn:schemas-microsoft-com:office:office" xmlns:oel="http://schemas.microsoft.com/office/2019/extlst" xmlns:r="http://schemas.openxmlformats.org/officeDocument/2006/relationships" xmlns:m="http://schemas.openxmlformats.org/officeDocument/2006/math" xmlns:v="urn:schemas-microsoft-com:vml" xmlns:wp14="http://schemas.microsoft.com/office/word/2010/wordprocessingDrawing" xmlns:wp="http://schemas.openxmlformats.org/drawingml/2006/wordprocessingDrawing" xmlns:w10="urn:schemas-microsoft-com:office:word" xmlns:w="http://schemas.openxmlformats.org/wordprocessingml/2006/main" xmlns:w14="http://schemas.microsoft.com/office/word/2010/wordml" xmlns:w15="http://schemas.microsoft.com/office/word/2012/wordml" xmlns:w16cex="http://schemas.microsoft.com/office/word/2018/wordml/cex" xmlns:w16cid="http://schemas.microsoft.com/office/word/2016/wordml/cid" xmlns:w16="http://schemas.microsoft.com/office/word/2018/wordml" xmlns:w16du="http://schemas.microsoft.com/office/word/2023/wordml/word16du" xmlns:w16sdtdh="http://schemas.microsoft.com/office/word/2020/wordml/sdtdatahash" xmlns:w16se="http://schemas.microsoft.com/office/word/2015/wordml/symex" xmlns:wpg="http://schemas.microsoft.com/office/word/2010/wordprocessingGroup" xmlns:wpi="http://schemas.microsoft.com/office/word/2010/wordprocessingInk" xmlns:wne="http://schemas.microsoft.com/office/word/2006/wordml" xmlns:wps="http://schemas.microsoft.com/office/word/2010/wordprocessingShape" mc:Ignorable="w14 w15 w16se w16cid w16 w16cex w16sdtdh w16du wp14">
+<w:ftr xmlns:wpc="http://schemas.microsoft.com/office/word/2010/wordprocessingCanvas" xmlns:cx="http://schemas.microsoft.com/office/drawing/2014/chartex" xmlns:cx1="http://schemas.microsoft.com/office/drawing/2015/9/8/chartex" xmlns:cx2="http://schemas.microsoft.com/office/drawing/2015/10/21/chartex" xmlns:cx3="http://schemas.microsoft.com/office/drawing/2016/5/9/chartex" xmlns:cx4="http://schemas.microsoft.com/office/drawing/2016/5/10/chartex" xmlns:cx5="http://schemas.microsoft.com/office/drawing/2016/5/11/chartex" xmlns:cx6="http://schemas.microsoft.com/office/drawing/2016/5/12/chartex" xmlns:cx7="http://schemas.microsoft.com/office/drawing/2016/5/13/chartex" xmlns:cx8="http://schemas.microsoft.com/office/drawing/2016/5/14/chartex" xmlns:mc="http://schemas.openxmlformats.org/markup-compatibility/2006" xmlns:aink="http://schemas.microsoft.com/office/drawing/2016/ink" xmlns:am3d="http://schemas.microsoft.com/office/drawing/2017/model3d" xmlns:o="urn:schemas-microsoft-com:office:office" xmlns:oel="http://schemas.microsoft.com/office/2019/extlst" xmlns:r="http://schemas.openxmlformats.org/officeDocument/2006/relationships" xmlns:m="http://schemas.openxmlformats.org/officeDocument/2006/math" xmlns:v="urn:schemas-microsoft-com:vml" xmlns:wp14="http://schemas.microsoft.com/office/word/2010/wordprocessingDrawing" xmlns:wp="http://schemas.openxmlformats.org/drawingml/2006/wordprocessingDrawing" xmlns:w10="urn:schemas-microsoft-com:office:word" xmlns:w="http://schemas.openxmlformats.org/wordprocessingml/2006/main" xmlns:w14="http://schemas.microsoft.com/office/word/2010/wordml" xmlns:w15="http://schemas.microsoft.com/office/word/2012/wordml" xmlns:w16cex="http://schemas.microsoft.com/office/word/2018/wordml/cex" xmlns:w16cid="http://schemas.microsoft.com/office/word/2016/wordml/cid" xmlns:w16="http://schemas.microsoft.com/office/word/2018/wordml" xmlns:w16du="http://schemas.microsoft.com/office/word/2023/wordml/word16du" xmlns:w16sdtdh="http://schemas.microsoft.com/office/word/2020/wordml/sdtdatahash" xmlns:w16sdtfl="http://schemas.microsoft.com/office/word/2024/wordml/sdtformatlock" xmlns:w16se="http://schemas.microsoft.com/office/word/2015/wordml/symex" xmlns:wpg="http://schemas.microsoft.com/office/word/2010/wordprocessingGroup" xmlns:wpi="http://schemas.microsoft.com/office/word/2010/wordprocessingInk" xmlns:wne="http://schemas.microsoft.com/office/word/2006/wordml" xmlns:wps="http://schemas.microsoft.com/office/word/2010/wordprocessingShape" mc:Ignorable="w14 w15 w16se w16cid w16 w16cex w16sdtdh w16sdtfl w16du wp14">
   <w:p>
     <w:pPr>
       <w:ind w:left="180" w:right="-288" w:hanging="270"/>
@@ -1505,7 +1609,6 @@
       <w:tc>
         <w:tcPr>
           <w:tcW w:w="3327" w:type="dxa"/>
-          <w:shd w:val="clear" w:color="auto" w:fill="auto"/>
         </w:tcPr>
         <w:p>
           <w:pPr>
@@ -1572,7 +1675,6 @@
       <w:tc>
         <w:tcPr>
           <w:tcW w:w="3477" w:type="dxa"/>
-          <w:shd w:val="clear" w:color="auto" w:fill="auto"/>
         </w:tcPr>
         <w:p>
           <w:pPr>
@@ -1685,7 +1787,6 @@
       <w:tc>
         <w:tcPr>
           <w:tcW w:w="3246" w:type="dxa"/>
-          <w:shd w:val="clear" w:color="auto" w:fill="auto"/>
         </w:tcPr>
         <w:p>
           <w:pPr>
@@ -1782,7 +1883,7 @@
 </file>
 
 <file path=word/footnotes.xml><?xml version="1.0" encoding="utf-8"?>
-<w:footnotes xmlns:wpc="http://schemas.microsoft.com/office/word/2010/wordprocessingCanvas" xmlns:cx="http://schemas.microsoft.com/office/drawing/2014/chartex" xmlns:cx1="http://schemas.microsoft.com/office/drawing/2015/9/8/chartex" xmlns:cx2="http://schemas.microsoft.com/office/drawing/2015/10/21/chartex" xmlns:cx3="http://schemas.microsoft.com/office/drawing/2016/5/9/chartex" xmlns:cx4="http://schemas.microsoft.com/office/drawing/2016/5/10/chartex" xmlns:cx5="http://schemas.microsoft.com/office/drawing/2016/5/11/chartex" xmlns:cx6="http://schemas.microsoft.com/office/drawing/2016/5/12/chartex" xmlns:cx7="http://schemas.microsoft.com/office/drawing/2016/5/13/chartex" xmlns:cx8="http://schemas.microsoft.com/office/drawing/2016/5/14/chartex" xmlns:mc="http://schemas.openxmlformats.org/markup-compatibility/2006" xmlns:aink="http://schemas.microsoft.com/office/drawing/2016/ink" xmlns:am3d="http://schemas.microsoft.com/office/drawing/2017/model3d" xmlns:o="urn:schemas-microsoft-com:office:office" xmlns:oel="http://schemas.microsoft.com/office/2019/extlst" xmlns:r="http://schemas.openxmlformats.org/officeDocument/2006/relationships" xmlns:m="http://schemas.openxmlformats.org/officeDocument/2006/math" xmlns:v="urn:schemas-microsoft-com:vml" xmlns:wp14="http://schemas.microsoft.com/office/word/2010/wordprocessingDrawing" xmlns:wp="http://schemas.openxmlformats.org/drawingml/2006/wordprocessingDrawing" xmlns:w10="urn:schemas-microsoft-com:office:word" xmlns:w="http://schemas.openxmlformats.org/wordprocessingml/2006/main" xmlns:w14="http://schemas.microsoft.com/office/word/2010/wordml" xmlns:w15="http://schemas.microsoft.com/office/word/2012/wordml" xmlns:w16cex="http://schemas.microsoft.com/office/word/2018/wordml/cex" xmlns:w16cid="http://schemas.microsoft.com/office/word/2016/wordml/cid" xmlns:w16="http://schemas.microsoft.com/office/word/2018/wordml" xmlns:w16du="http://schemas.microsoft.com/office/word/2023/wordml/word16du" xmlns:w16sdtdh="http://schemas.microsoft.com/office/word/2020/wordml/sdtdatahash" xmlns:w16se="http://schemas.microsoft.com/office/word/2015/wordml/symex" xmlns:wpg="http://schemas.microsoft.com/office/word/2010/wordprocessingGroup" xmlns:wpi="http://schemas.microsoft.com/office/word/2010/wordprocessingInk" xmlns:wne="http://schemas.microsoft.com/office/word/2006/wordml" xmlns:wps="http://schemas.microsoft.com/office/word/2010/wordprocessingShape" mc:Ignorable="w14 w15 w16se w16cid w16 w16cex w16sdtdh w16du wp14">
+<w:footnotes xmlns:wpc="http://schemas.microsoft.com/office/word/2010/wordprocessingCanvas" xmlns:cx="http://schemas.microsoft.com/office/drawing/2014/chartex" xmlns:cx1="http://schemas.microsoft.com/office/drawing/2015/9/8/chartex" xmlns:cx2="http://schemas.microsoft.com/office/drawing/2015/10/21/chartex" xmlns:cx3="http://schemas.microsoft.com/office/drawing/2016/5/9/chartex" xmlns:cx4="http://schemas.microsoft.com/office/drawing/2016/5/10/chartex" xmlns:cx5="http://schemas.microsoft.com/office/drawing/2016/5/11/chartex" xmlns:cx6="http://schemas.microsoft.com/office/drawing/2016/5/12/chartex" xmlns:cx7="http://schemas.microsoft.com/office/drawing/2016/5/13/chartex" xmlns:cx8="http://schemas.microsoft.com/office/drawing/2016/5/14/chartex" xmlns:mc="http://schemas.openxmlformats.org/markup-compatibility/2006" xmlns:aink="http://schemas.microsoft.com/office/drawing/2016/ink" xmlns:am3d="http://schemas.microsoft.com/office/drawing/2017/model3d" xmlns:o="urn:schemas-microsoft-com:office:office" xmlns:oel="http://schemas.microsoft.com/office/2019/extlst" xmlns:r="http://schemas.openxmlformats.org/officeDocument/2006/relationships" xmlns:m="http://schemas.openxmlformats.org/officeDocument/2006/math" xmlns:v="urn:schemas-microsoft-com:vml" xmlns:wp14="http://schemas.microsoft.com/office/word/2010/wordprocessingDrawing" xmlns:wp="http://schemas.openxmlformats.org/drawingml/2006/wordprocessingDrawing" xmlns:w10="urn:schemas-microsoft-com:office:word" xmlns:w="http://schemas.openxmlformats.org/wordprocessingml/2006/main" xmlns:w14="http://schemas.microsoft.com/office/word/2010/wordml" xmlns:w15="http://schemas.microsoft.com/office/word/2012/wordml" xmlns:w16cex="http://schemas.microsoft.com/office/word/2018/wordml/cex" xmlns:w16cid="http://schemas.microsoft.com/office/word/2016/wordml/cid" xmlns:w16="http://schemas.microsoft.com/office/word/2018/wordml" xmlns:w16du="http://schemas.microsoft.com/office/word/2023/wordml/word16du" xmlns:w16sdtdh="http://schemas.microsoft.com/office/word/2020/wordml/sdtdatahash" xmlns:w16sdtfl="http://schemas.microsoft.com/office/word/2024/wordml/sdtformatlock" xmlns:w16se="http://schemas.microsoft.com/office/word/2015/wordml/symex" xmlns:wpg="http://schemas.microsoft.com/office/word/2010/wordprocessingGroup" xmlns:wpi="http://schemas.microsoft.com/office/word/2010/wordprocessingInk" xmlns:wne="http://schemas.microsoft.com/office/word/2006/wordml" xmlns:wps="http://schemas.microsoft.com/office/word/2010/wordprocessingShape" mc:Ignorable="w14 w15 w16se w16cid w16 w16cex w16sdtdh w16sdtfl w16du wp14">
   <w:footnote w:type="separator" w:id="-1">
     <w:p>
       <w:r>
@@ -1801,7 +1902,7 @@
 </file>
 
 <file path=word/header1.xml><?xml version="1.0" encoding="utf-8"?>
-<w:hdr xmlns:wpc="http://schemas.microsoft.com/office/word/2010/wordprocessingCanvas" xmlns:cx="http://schemas.microsoft.com/office/drawing/2014/chartex" xmlns:cx1="http://schemas.microsoft.com/office/drawing/2015/9/8/chartex" xmlns:cx2="http://schemas.microsoft.com/office/drawing/2015/10/21/chartex" xmlns:cx3="http://schemas.microsoft.com/office/drawing/2016/5/9/chartex" xmlns:cx4="http://schemas.microsoft.com/office/drawing/2016/5/10/chartex" xmlns:cx5="http://schemas.microsoft.com/office/drawing/2016/5/11/chartex" xmlns:cx6="http://schemas.microsoft.com/office/drawing/2016/5/12/chartex" xmlns:cx7="http://schemas.microsoft.com/office/drawing/2016/5/13/chartex" xmlns:cx8="http://schemas.microsoft.com/office/drawing/2016/5/14/chartex" xmlns:mc="http://schemas.openxmlformats.org/markup-compatibility/2006" xmlns:aink="http://schemas.microsoft.com/office/drawing/2016/ink" xmlns:am3d="http://schemas.microsoft.com/office/drawing/2017/model3d" xmlns:o="urn:schemas-microsoft-com:office:office" xmlns:oel="http://schemas.microsoft.com/office/2019/extlst" xmlns:r="http://schemas.openxmlformats.org/officeDocument/2006/relationships" xmlns:m="http://schemas.openxmlformats.org/officeDocument/2006/math" xmlns:v="urn:schemas-microsoft-com:vml" xmlns:wp14="http://schemas.microsoft.com/office/word/2010/wordprocessingDrawing" xmlns:wp="http://schemas.openxmlformats.org/drawingml/2006/wordprocessingDrawing" xmlns:w10="urn:schemas-microsoft-com:office:word" xmlns:w="http://schemas.openxmlformats.org/wordprocessingml/2006/main" xmlns:w14="http://schemas.microsoft.com/office/word/2010/wordml" xmlns:w15="http://schemas.microsoft.com/office/word/2012/wordml" xmlns:w16cex="http://schemas.microsoft.com/office/word/2018/wordml/cex" xmlns:w16cid="http://schemas.microsoft.com/office/word/2016/wordml/cid" xmlns:w16="http://schemas.microsoft.com/office/word/2018/wordml" xmlns:w16du="http://schemas.microsoft.com/office/word/2023/wordml/word16du" xmlns:w16sdtdh="http://schemas.microsoft.com/office/word/2020/wordml/sdtdatahash" xmlns:w16se="http://schemas.microsoft.com/office/word/2015/wordml/symex" xmlns:wpg="http://schemas.microsoft.com/office/word/2010/wordprocessingGroup" xmlns:wpi="http://schemas.microsoft.com/office/word/2010/wordprocessingInk" xmlns:wne="http://schemas.microsoft.com/office/word/2006/wordml" xmlns:wps="http://schemas.microsoft.com/office/word/2010/wordprocessingShape" mc:Ignorable="w14 w15 w16se w16cid w16 w16cex w16sdtdh w16du wp14">
+<w:hdr xmlns:wpc="http://schemas.microsoft.com/office/word/2010/wordprocessingCanvas" xmlns:cx="http://schemas.microsoft.com/office/drawing/2014/chartex" xmlns:cx1="http://schemas.microsoft.com/office/drawing/2015/9/8/chartex" xmlns:cx2="http://schemas.microsoft.com/office/drawing/2015/10/21/chartex" xmlns:cx3="http://schemas.microsoft.com/office/drawing/2016/5/9/chartex" xmlns:cx4="http://schemas.microsoft.com/office/drawing/2016/5/10/chartex" xmlns:cx5="http://schemas.microsoft.com/office/drawing/2016/5/11/chartex" xmlns:cx6="http://schemas.microsoft.com/office/drawing/2016/5/12/chartex" xmlns:cx7="http://schemas.microsoft.com/office/drawing/2016/5/13/chartex" xmlns:cx8="http://schemas.microsoft.com/office/drawing/2016/5/14/chartex" xmlns:mc="http://schemas.openxmlformats.org/markup-compatibility/2006" xmlns:aink="http://schemas.microsoft.com/office/drawing/2016/ink" xmlns:am3d="http://schemas.microsoft.com/office/drawing/2017/model3d" xmlns:o="urn:schemas-microsoft-com:office:office" xmlns:oel="http://schemas.microsoft.com/office/2019/extlst" xmlns:r="http://schemas.openxmlformats.org/officeDocument/2006/relationships" xmlns:m="http://schemas.openxmlformats.org/officeDocument/2006/math" xmlns:v="urn:schemas-microsoft-com:vml" xmlns:wp14="http://schemas.microsoft.com/office/word/2010/wordprocessingDrawing" xmlns:wp="http://schemas.openxmlformats.org/drawingml/2006/wordprocessingDrawing" xmlns:w10="urn:schemas-microsoft-com:office:word" xmlns:w="http://schemas.openxmlformats.org/wordprocessingml/2006/main" xmlns:w14="http://schemas.microsoft.com/office/word/2010/wordml" xmlns:w15="http://schemas.microsoft.com/office/word/2012/wordml" xmlns:w16cex="http://schemas.microsoft.com/office/word/2018/wordml/cex" xmlns:w16cid="http://schemas.microsoft.com/office/word/2016/wordml/cid" xmlns:w16="http://schemas.microsoft.com/office/word/2018/wordml" xmlns:w16du="http://schemas.microsoft.com/office/word/2023/wordml/word16du" xmlns:w16sdtdh="http://schemas.microsoft.com/office/word/2020/wordml/sdtdatahash" xmlns:w16sdtfl="http://schemas.microsoft.com/office/word/2024/wordml/sdtformatlock" xmlns:w16se="http://schemas.microsoft.com/office/word/2015/wordml/symex" xmlns:wpg="http://schemas.microsoft.com/office/word/2010/wordprocessingGroup" xmlns:wpi="http://schemas.microsoft.com/office/word/2010/wordprocessingInk" xmlns:wne="http://schemas.microsoft.com/office/word/2006/wordml" xmlns:wps="http://schemas.microsoft.com/office/word/2010/wordprocessingShape" mc:Ignorable="w14 w15 w16se w16cid w16 w16cex w16sdtdh w16sdtfl w16du wp14">
   <w:tbl>
     <w:tblPr>
       <w:tblW w:w="10080" w:type="dxa"/>
@@ -1911,7 +2012,7 @@
 </file>
 
 <file path=word/numbering.xml><?xml version="1.0" encoding="utf-8"?>
-<w:numbering xmlns:wpc="http://schemas.microsoft.com/office/word/2010/wordprocessingCanvas" xmlns:cx="http://schemas.microsoft.com/office/drawing/2014/chartex" xmlns:cx1="http://schemas.microsoft.com/office/drawing/2015/9/8/chartex" xmlns:cx2="http://schemas.microsoft.com/office/drawing/2015/10/21/chartex" xmlns:cx3="http://schemas.microsoft.com/office/drawing/2016/5/9/chartex" xmlns:cx4="http://schemas.microsoft.com/office/drawing/2016/5/10/chartex" xmlns:cx5="http://schemas.microsoft.com/office/drawing/2016/5/11/chartex" xmlns:cx6="http://schemas.microsoft.com/office/drawing/2016/5/12/chartex" xmlns:cx7="http://schemas.microsoft.com/office/drawing/2016/5/13/chartex" xmlns:cx8="http://schemas.microsoft.com/office/drawing/2016/5/14/chartex" xmlns:mc="http://schemas.openxmlformats.org/markup-compatibility/2006" xmlns:aink="http://schemas.microsoft.com/office/drawing/2016/ink" xmlns:am3d="http://schemas.microsoft.com/office/drawing/2017/model3d" xmlns:o="urn:schemas-microsoft-com:office:office" xmlns:oel="http://schemas.microsoft.com/office/2019/extlst" xmlns:r="http://schemas.openxmlformats.org/officeDocument/2006/relationships" xmlns:m="http://schemas.openxmlformats.org/officeDocument/2006/math" xmlns:v="urn:schemas-microsoft-com:vml" xmlns:wp14="http://schemas.microsoft.com/office/word/2010/wordprocessingDrawing" xmlns:wp="http://schemas.openxmlformats.org/drawingml/2006/wordprocessingDrawing" xmlns:w10="urn:schemas-microsoft-com:office:word" xmlns:w="http://schemas.openxmlformats.org/wordprocessingml/2006/main" xmlns:w14="http://schemas.microsoft.com/office/word/2010/wordml" xmlns:w15="http://schemas.microsoft.com/office/word/2012/wordml" xmlns:w16cex="http://schemas.microsoft.com/office/word/2018/wordml/cex" xmlns:w16cid="http://schemas.microsoft.com/office/word/2016/wordml/cid" xmlns:w16="http://schemas.microsoft.com/office/word/2018/wordml" xmlns:w16du="http://schemas.microsoft.com/office/word/2023/wordml/word16du" xmlns:w16sdtdh="http://schemas.microsoft.com/office/word/2020/wordml/sdtdatahash" xmlns:w16se="http://schemas.microsoft.com/office/word/2015/wordml/symex" xmlns:wpg="http://schemas.microsoft.com/office/word/2010/wordprocessingGroup" xmlns:wpi="http://schemas.microsoft.com/office/word/2010/wordprocessingInk" xmlns:wne="http://schemas.microsoft.com/office/word/2006/wordml" xmlns:wps="http://schemas.microsoft.com/office/word/2010/wordprocessingShape" mc:Ignorable="w14 w15 w16se w16cid w16 w16cex w16sdtdh w16du wp14">
+<w:numbering xmlns:wpc="http://schemas.microsoft.com/office/word/2010/wordprocessingCanvas" xmlns:cx="http://schemas.microsoft.com/office/drawing/2014/chartex" xmlns:cx1="http://schemas.microsoft.com/office/drawing/2015/9/8/chartex" xmlns:cx2="http://schemas.microsoft.com/office/drawing/2015/10/21/chartex" xmlns:cx3="http://schemas.microsoft.com/office/drawing/2016/5/9/chartex" xmlns:cx4="http://schemas.microsoft.com/office/drawing/2016/5/10/chartex" xmlns:cx5="http://schemas.microsoft.com/office/drawing/2016/5/11/chartex" xmlns:cx6="http://schemas.microsoft.com/office/drawing/2016/5/12/chartex" xmlns:cx7="http://schemas.microsoft.com/office/drawing/2016/5/13/chartex" xmlns:cx8="http://schemas.microsoft.com/office/drawing/2016/5/14/chartex" xmlns:mc="http://schemas.openxmlformats.org/markup-compatibility/2006" xmlns:aink="http://schemas.microsoft.com/office/drawing/2016/ink" xmlns:am3d="http://schemas.microsoft.com/office/drawing/2017/model3d" xmlns:o="urn:schemas-microsoft-com:office:office" xmlns:oel="http://schemas.microsoft.com/office/2019/extlst" xmlns:r="http://schemas.openxmlformats.org/officeDocument/2006/relationships" xmlns:m="http://schemas.openxmlformats.org/officeDocument/2006/math" xmlns:v="urn:schemas-microsoft-com:vml" xmlns:wp14="http://schemas.microsoft.com/office/word/2010/wordprocessingDrawing" xmlns:wp="http://schemas.openxmlformats.org/drawingml/2006/wordprocessingDrawing" xmlns:w10="urn:schemas-microsoft-com:office:word" xmlns:w="http://schemas.openxmlformats.org/wordprocessingml/2006/main" xmlns:w14="http://schemas.microsoft.com/office/word/2010/wordml" xmlns:w15="http://schemas.microsoft.com/office/word/2012/wordml" xmlns:w16cex="http://schemas.microsoft.com/office/word/2018/wordml/cex" xmlns:w16cid="http://schemas.microsoft.com/office/word/2016/wordml/cid" xmlns:w16="http://schemas.microsoft.com/office/word/2018/wordml" xmlns:w16du="http://schemas.microsoft.com/office/word/2023/wordml/word16du" xmlns:w16sdtdh="http://schemas.microsoft.com/office/word/2020/wordml/sdtdatahash" xmlns:w16sdtfl="http://schemas.microsoft.com/office/word/2024/wordml/sdtformatlock" xmlns:w16se="http://schemas.microsoft.com/office/word/2015/wordml/symex" xmlns:wpg="http://schemas.microsoft.com/office/word/2010/wordprocessingGroup" xmlns:wpi="http://schemas.microsoft.com/office/word/2010/wordprocessingInk" xmlns:wne="http://schemas.microsoft.com/office/word/2006/wordml" xmlns:wps="http://schemas.microsoft.com/office/word/2010/wordprocessingShape" mc:Ignorable="w14 w15 w16se w16cid w16 w16cex w16sdtdh w16sdtfl w16du wp14">
   <w:abstractNum w:abstractNumId="0" w15:restartNumberingAfterBreak="0">
     <w:nsid w:val="182046E7"/>
     <w:multiLevelType w:val="hybridMultilevel"/>
@@ -2101,7 +2202,7 @@
 </file>
 
 <file path=word/styles.xml><?xml version="1.0" encoding="utf-8"?>
-<w:styles xmlns:mc="http://schemas.openxmlformats.org/markup-compatibility/2006" xmlns:r="http://schemas.openxmlformats.org/officeDocument/2006/relationships" xmlns:w="http://schemas.openxmlformats.org/wordprocessingml/2006/main" xmlns:w14="http://schemas.microsoft.com/office/word/2010/wordml" xmlns:w15="http://schemas.microsoft.com/office/word/2012/wordml" xmlns:w16cex="http://schemas.microsoft.com/office/word/2018/wordml/cex" xmlns:w16cid="http://schemas.microsoft.com/office/word/2016/wordml/cid" xmlns:w16="http://schemas.microsoft.com/office/word/2018/wordml" xmlns:w16du="http://schemas.microsoft.com/office/word/2023/wordml/word16du" xmlns:w16sdtdh="http://schemas.microsoft.com/office/word/2020/wordml/sdtdatahash" xmlns:w16se="http://schemas.microsoft.com/office/word/2015/wordml/symex" mc:Ignorable="w14 w15 w16se w16cid w16 w16cex w16sdtdh w16du">
+<w:styles xmlns:mc="http://schemas.openxmlformats.org/markup-compatibility/2006" xmlns:r="http://schemas.openxmlformats.org/officeDocument/2006/relationships" xmlns:w="http://schemas.openxmlformats.org/wordprocessingml/2006/main" xmlns:w14="http://schemas.microsoft.com/office/word/2010/wordml" xmlns:w15="http://schemas.microsoft.com/office/word/2012/wordml" xmlns:w16cex="http://schemas.microsoft.com/office/word/2018/wordml/cex" xmlns:w16cid="http://schemas.microsoft.com/office/word/2016/wordml/cid" xmlns:w16="http://schemas.microsoft.com/office/word/2018/wordml" xmlns:w16du="http://schemas.microsoft.com/office/word/2023/wordml/word16du" xmlns:w16sdtdh="http://schemas.microsoft.com/office/word/2020/wordml/sdtdatahash" xmlns:w16sdtfl="http://schemas.microsoft.com/office/word/2024/wordml/sdtformatlock" xmlns:w16se="http://schemas.microsoft.com/office/word/2015/wordml/symex" mc:Ignorable="w14 w15 w16se w16cid w16 w16cex w16sdtdh w16sdtfl w16du">
   <w:docDefaults>
     <w:rPrDefault>
       <w:rPr>

</xml_diff>